<commit_message>
docs: fix the specialty code in the lab report
</commit_message>
<xml_diff>
--- a/docs/Отчет_ЛР1_Бокач.docx
+++ b/docs/Отчет_ЛР1_Бокач.docx
@@ -218,7 +218,16 @@
       </w:r>
       <w:proofErr w:type="spellEnd"/>
       <w:r>
-        <w:t xml:space="preserve"> 09.03.03 </w:t>
+        <w:t xml:space="preserve"> 09.03.0</w:t>
+      </w:r>
+      <w:r>
+        <w:rPr>
+          <w:lang w:val="ru-RU"/>
+        </w:rPr>
+        <w:t>4</w:t>
+      </w:r>
+      <w:r>
+        <w:t xml:space="preserve"> </w:t>
       </w:r>
       <w:proofErr w:type="spellStart"/>
       <w:r>
@@ -1278,7 +1287,7 @@
         <w:rPr>
           <w:lang w:val="ru-RU"/>
         </w:rPr>
-        <w:t xml:space="preserve">– реализовать экран каталога с поиском по названию, экран детали плагина и экран вендора;</w:t>
+        <w:t>– реализовать экран каталога с поиском по названию, экран детали плагина и экран вендора;</w:t>
       </w:r>
     </w:p>
     <w:p>
@@ -1399,6 +1408,7 @@
         <w:rPr>
           <w:lang w:val="ru-RU"/>
         </w:rPr>
+        <w:lastRenderedPageBreak/>
         <w:t>1 ПОСТАНОВКА ЗАДАЧИ</w:t>
       </w:r>
     </w:p>
@@ -1414,7 +1424,7 @@
         <w:rPr>
           <w:lang w:val="ru-RU"/>
         </w:rPr>
-        <w:t xml:space="preserve">Приложение представляет собой каталог плагинов и состоит из трёх экранов: каталога, детали плагина и страницы вендора. Каталог показывает название плагина, имя вендора, число загрузок, оценку, теги и модель распространения. Над списком расположено поле поиска: в каталоге остаются только плагины, в названии которых встречается введённая строка. Деталь содержит сведения, которых нет в каталоге: идентификатор плагина для файла конфигурации, описание и ссылки, заполненные разработчиком, – документацию, исходный код, баг-трекер и форум. С детали выполняется переход на страницу вендора, где приведены сведения о разработчике и список его плагинов, и каждый плагин этого списка снова открывает деталь.</w:t>
+        <w:t>Приложение представляет собой каталог плагинов и состоит из трёх экранов: каталога, детали плагина и страницы вендора. Каталог показывает название плагина, имя вендора, число загрузок, оценку, теги и модель распространения. Над списком расположено поле поиска: в каталоге остаются только плагины, в названии которых встречается введённая строка. Деталь содержит сведения, которых нет в каталоге: идентификатор плагина для файла конфигурации, описание и ссылки, заполненные разработчиком, – документацию, исходный код, баг-трекер и форум. С детали выполняется переход на страницу вендора, где приведены сведения о разработчике и список его плагинов, и каждый плагин этого списка снова открывает деталь.</w:t>
       </w:r>
     </w:p>
     <w:p>
@@ -1513,7 +1523,7 @@
         <w:rPr>
           <w:lang w:val="ru-RU"/>
         </w:rPr>
-        <w:t xml:space="preserve">Особенность источника состоит в том, что метод поиска не возвращает список без параметра запроса: обращение без него приводит к пустому результату. На текущей вехе это ограничение не проявляется: моковый репозиторий отдаёт все записи сразу, а поиск по названию фильтрует уже загруженный список в памяти. На следующей вехе строка из поля поиска станет параметром запроса, а для пустого поля экрану придётся либо подставлять запрос по умолчанию, либо предлагать пользователю ввести его. Решение относится к слою представления, поэтому описание репозитория от него не зависит.</w:t>
+        <w:t>Особенность источника состоит в том, что метод поиска не возвращает список без параметра запроса: обращение без него приводит к пустому результату. На текущей вехе это ограничение не проявляется: моковый репозиторий отдаёт все записи сразу, а поиск по названию фильтрует уже загруженный список в памяти. На следующей вехе строка из поля поиска станет параметром запроса, а для пустого поля экрану придётся либо подставлять запрос по умолчанию, либо предлагать пользователю ввести его. Решение относится к слою представления, поэтому описание репозитория от него не зависит.</w:t>
       </w:r>
     </w:p>
     <w:p>
@@ -1729,7 +1739,15 @@
                 <w:sz w:val="24"/>
                 <w:lang w:val="ru-RU"/>
               </w:rPr>
-              <w:t>Заданы все три спецификации перехода: прямая, обратная и предиктивная</w:t>
+              <w:t xml:space="preserve">Заданы все три спецификации перехода: </w:t>
+            </w:r>
+            <w:r>
+              <w:rPr>
+                <w:sz w:val="24"/>
+                <w:lang w:val="ru-RU"/>
+              </w:rPr>
+              <w:lastRenderedPageBreak/>
+              <w:t>прямая, обратная и предиктивная</w:t>
             </w:r>
           </w:p>
         </w:tc>
@@ -1750,6 +1768,7 @@
                 <w:sz w:val="24"/>
                 <w:lang w:val="ru-RU"/>
               </w:rPr>
+              <w:lastRenderedPageBreak/>
               <w:t>Подписи в строковых ресурсах, две локали</w:t>
             </w:r>
           </w:p>
@@ -1982,7 +2001,6 @@
               <w:rPr>
                 <w:sz w:val="24"/>
               </w:rPr>
-              <w:lastRenderedPageBreak/>
               <w:t>Отчёт</w:t>
             </w:r>
             <w:proofErr w:type="spellEnd"/>
@@ -2150,7 +2168,7 @@
         <w:rPr>
           <w:lang w:val="ru-RU"/>
         </w:rPr>
-        <w:t xml:space="preserve">Код общего модуля разделён на три слоя. Слой domain содержит модели предметной области и описание репозитория в виде интерфейса. Слой data содержит моковые данные и реализацию репозитория. Слой ui содержит экраны, переиспользуемые компоненты, тему, навигацию и модели представления; пакет каждого экрана объединяет вёрстку, состояние, намерения и ViewModel. Функции форматирования чисел к моделям представления не относятся и вынесены в отдельный пакет utils. Зависимости направлены к слою domain: слой ui пользуется его моделями, слой data преобразует полученные сведения в эти же модели, а сам domain не знает ни о том, откуда берутся записи, ни о том, как они выглядят на экране.</w:t>
+        <w:t>Код общего модуля разделён на три слоя. Слой domain содержит модели предметной области и описание репозитория в виде интерфейса. Слой data содержит моковые данные и реализацию репозитория. Слой ui содержит экраны, переиспользуемые компоненты, тему, навигацию и модели представления; пакет каждого экрана объединяет вёрстку, состояние, намерения и ViewModel. Функции форматирования чисел к моделям представления не относятся и вынесены в отдельный пакет utils. Зависимости направлены к слою domain: слой ui пользуется его моделями, слой data преобразует полученные сведения в эти же модели, а сам domain не знает ни о том, откуда берутся записи, ни о том, как они выглядят на экране.</w:t>
       </w:r>
     </w:p>
     <w:p>
@@ -2521,17 +2539,36 @@
     <w:p>
       <w:pPr>
         <w:spacing w:line="240" w:lineRule="auto"/>
-        <w:rPr>
-          <w:lang w:val="ru-RU"/>
-        </w:rPr>
-      </w:pPr>
-      <w:r>
-        <w:rPr>
-          <w:rFonts w:ascii="Courier New" w:eastAsia="Courier New" w:hAnsi="Courier New" w:cs="Courier New"/>
-          <w:sz w:val="20"/>
-          <w:lang w:val="ru-RU"/>
-        </w:rPr>
-        <w:t xml:space="preserve">  ui/screens/               экраны: catalog, detail, vendor;</w:t>
+      </w:pPr>
+      <w:r>
+        <w:rPr>
+          <w:rFonts w:ascii="Courier New" w:eastAsia="Courier New" w:hAnsi="Courier New" w:cs="Courier New"/>
+          <w:sz w:val="20"/>
+          <w:lang w:val="ru-RU"/>
+        </w:rPr>
+        <w:t xml:space="preserve">  </w:t>
+      </w:r>
+      <w:r>
+        <w:rPr>
+          <w:rFonts w:ascii="Courier New" w:eastAsia="Courier New" w:hAnsi="Courier New" w:cs="Courier New"/>
+          <w:sz w:val="20"/>
+        </w:rPr>
+        <w:t xml:space="preserve">ui/screens/               </w:t>
+      </w:r>
+      <w:r>
+        <w:rPr>
+          <w:rFonts w:ascii="Courier New" w:eastAsia="Courier New" w:hAnsi="Courier New" w:cs="Courier New"/>
+          <w:sz w:val="20"/>
+          <w:lang w:val="ru-RU"/>
+        </w:rPr>
+        <w:t>экраны</w:t>
+      </w:r>
+      <w:r>
+        <w:rPr>
+          <w:rFonts w:ascii="Courier New" w:eastAsia="Courier New" w:hAnsi="Courier New" w:cs="Courier New"/>
+          <w:sz w:val="20"/>
+        </w:rPr>
+        <w:t>: catalog, detail, vendor;</w:t>
       </w:r>
     </w:p>
     <w:p>
@@ -2545,9 +2582,16 @@
         <w:rPr>
           <w:rFonts w:ascii="Courier New" w:eastAsia="Courier New" w:hAnsi="Courier New" w:cs="Courier New"/>
           <w:sz w:val="20"/>
-          <w:lang w:val="ru-RU"/>
-        </w:rPr>
-        <w:t xml:space="preserve">                            в каждом вёрстка, состояние,</w:t>
+        </w:rPr>
+        <w:t xml:space="preserve">                            </w:t>
+      </w:r>
+      <w:r>
+        <w:rPr>
+          <w:rFonts w:ascii="Courier New" w:eastAsia="Courier New" w:hAnsi="Courier New" w:cs="Courier New"/>
+          <w:sz w:val="20"/>
+          <w:lang w:val="ru-RU"/>
+        </w:rPr>
+        <w:t>в каждом вёрстка, состояние,</w:t>
       </w:r>
     </w:p>
     <w:p>
@@ -2563,23 +2607,66 @@
           <w:sz w:val="20"/>
           <w:lang w:val="ru-RU"/>
         </w:rPr>
+        <w:lastRenderedPageBreak/>
         <w:t xml:space="preserve">                            намерения и ViewModel</w:t>
       </w:r>
     </w:p>
     <w:p>
       <w:pPr>
         <w:spacing w:line="240" w:lineRule="auto"/>
-        <w:rPr>
-          <w:lang w:val="ru-RU"/>
-        </w:rPr>
-      </w:pPr>
-      <w:r>
-        <w:rPr>
-          <w:rFonts w:ascii="Courier New" w:eastAsia="Courier New" w:hAnsi="Courier New" w:cs="Courier New"/>
-          <w:sz w:val="20"/>
-          <w:lang w:val="ru-RU"/>
-        </w:rPr>
-        <w:t xml:space="preserve">  ui/components/            переиспользуемые элементы интерфейса</w:t>
+      </w:pPr>
+      <w:r>
+        <w:rPr>
+          <w:rFonts w:ascii="Courier New" w:eastAsia="Courier New" w:hAnsi="Courier New" w:cs="Courier New"/>
+          <w:sz w:val="20"/>
+          <w:lang w:val="ru-RU"/>
+        </w:rPr>
+        <w:t xml:space="preserve">  </w:t>
+      </w:r>
+      <w:r>
+        <w:rPr>
+          <w:rFonts w:ascii="Courier New" w:eastAsia="Courier New" w:hAnsi="Courier New" w:cs="Courier New"/>
+          <w:sz w:val="20"/>
+        </w:rPr>
+        <w:t xml:space="preserve">ui/components/            </w:t>
+      </w:r>
+      <w:r>
+        <w:rPr>
+          <w:rFonts w:ascii="Courier New" w:eastAsia="Courier New" w:hAnsi="Courier New" w:cs="Courier New"/>
+          <w:sz w:val="20"/>
+          <w:lang w:val="ru-RU"/>
+        </w:rPr>
+        <w:t>переиспользуемые</w:t>
+      </w:r>
+      <w:r>
+        <w:rPr>
+          <w:rFonts w:ascii="Courier New" w:eastAsia="Courier New" w:hAnsi="Courier New" w:cs="Courier New"/>
+          <w:sz w:val="20"/>
+        </w:rPr>
+        <w:t xml:space="preserve"> </w:t>
+      </w:r>
+      <w:r>
+        <w:rPr>
+          <w:rFonts w:ascii="Courier New" w:eastAsia="Courier New" w:hAnsi="Courier New" w:cs="Courier New"/>
+          <w:sz w:val="20"/>
+          <w:lang w:val="ru-RU"/>
+        </w:rPr>
+        <w:t>элементы</w:t>
+      </w:r>
+      <w:r>
+        <w:rPr>
+          <w:rFonts w:ascii="Courier New" w:eastAsia="Courier New" w:hAnsi="Courier New" w:cs="Courier New"/>
+          <w:sz w:val="20"/>
+        </w:rPr>
+        <w:t xml:space="preserve"> </w:t>
+      </w:r>
+      <w:r>
+        <w:rPr>
+          <w:rFonts w:ascii="Courier New" w:eastAsia="Courier New" w:hAnsi="Courier New" w:cs="Courier New"/>
+          <w:sz w:val="20"/>
+          <w:lang w:val="ru-RU"/>
+        </w:rPr>
+        <w:t>интерфейса</w:t>
       </w:r>
     </w:p>
     <w:p>
@@ -2645,13 +2732,54 @@
     <w:p>
       <w:pPr>
         <w:spacing w:line="240" w:lineRule="auto"/>
-      </w:pPr>
-      <w:r>
-        <w:rPr>
-          <w:rFonts w:ascii="Courier New" w:eastAsia="Courier New" w:hAnsi="Courier New" w:cs="Courier New"/>
-          <w:sz w:val="20"/>
-        </w:rPr>
-        <w:t xml:space="preserve">  values/ values-en/        подписи интерфейса на двух языках</w:t>
+        <w:rPr>
+          <w:lang w:val="ru-RU"/>
+        </w:rPr>
+      </w:pPr>
+      <w:r>
+        <w:rPr>
+          <w:rFonts w:ascii="Courier New" w:eastAsia="Courier New" w:hAnsi="Courier New" w:cs="Courier New"/>
+          <w:sz w:val="20"/>
+        </w:rPr>
+        <w:t xml:space="preserve">  values</w:t>
+      </w:r>
+      <w:r>
+        <w:rPr>
+          <w:rFonts w:ascii="Courier New" w:eastAsia="Courier New" w:hAnsi="Courier New" w:cs="Courier New"/>
+          <w:sz w:val="20"/>
+          <w:lang w:val="ru-RU"/>
+        </w:rPr>
+        <w:t xml:space="preserve">/ </w:t>
+      </w:r>
+      <w:r>
+        <w:rPr>
+          <w:rFonts w:ascii="Courier New" w:eastAsia="Courier New" w:hAnsi="Courier New" w:cs="Courier New"/>
+          <w:sz w:val="20"/>
+        </w:rPr>
+        <w:t>values</w:t>
+      </w:r>
+      <w:r>
+        <w:rPr>
+          <w:rFonts w:ascii="Courier New" w:eastAsia="Courier New" w:hAnsi="Courier New" w:cs="Courier New"/>
+          <w:sz w:val="20"/>
+          <w:lang w:val="ru-RU"/>
+        </w:rPr>
+        <w:t>-</w:t>
+      </w:r>
+      <w:r>
+        <w:rPr>
+          <w:rFonts w:ascii="Courier New" w:eastAsia="Courier New" w:hAnsi="Courier New" w:cs="Courier New"/>
+          <w:sz w:val="20"/>
+        </w:rPr>
+        <w:t>en</w:t>
+      </w:r>
+      <w:r>
+        <w:rPr>
+          <w:rFonts w:ascii="Courier New" w:eastAsia="Courier New" w:hAnsi="Courier New" w:cs="Courier New"/>
+          <w:sz w:val="20"/>
+          <w:lang w:val="ru-RU"/>
+        </w:rPr>
+        <w:t>/        подписи интерфейса на двух языках</w:t>
       </w:r>
     </w:p>
     <w:p>
@@ -2665,8 +2793,16 @@
         <w:rPr>
           <w:rFonts w:ascii="Courier New" w:eastAsia="Courier New" w:hAnsi="Courier New" w:cs="Courier New"/>
           <w:sz w:val="20"/>
-        </w:rPr>
-        <w:t xml:space="preserve">  drawable</w:t>
+          <w:lang w:val="ru-RU"/>
+        </w:rPr>
+        <w:t xml:space="preserve">  </w:t>
+      </w:r>
+      <w:r>
+        <w:rPr>
+          <w:rFonts w:ascii="Courier New" w:eastAsia="Courier New" w:hAnsi="Courier New" w:cs="Courier New"/>
+          <w:sz w:val="20"/>
+        </w:rPr>
+        <w:t>drawable</w:t>
       </w:r>
       <w:r>
         <w:rPr>
@@ -2705,7 +2841,7 @@
         <w:rPr>
           <w:lang w:val="ru-RU"/>
         </w:rPr>
-        <w:t xml:space="preserve">Логика каждого экрана вынесена в отдельный класс ViewModel, который лежит в пакете экрана рядом с его вёрсткой. Внутри него состояние хранится в изменяемом потоке, а наружу отдаётся поток только для чтения, поэтому изменить состояние извне невозможно. Действия пользователя приходят в единственный метод обработки намерений. Зависимости уровня приложения – репозиторий и навигатор – создаются в корневой функции и передаются вниз.</w:t>
+        <w:t>Логика каждого экрана вынесена в отдельный класс ViewModel, который лежит в пакете экрана рядом с его вёрсткой. Внутри него состояние хранится в изменяемом потоке, а наружу отдаётся поток только для чтения, поэтому изменить состояние извне невозможно. Действия пользователя приходят в единственный метод обработки намерений. Зависимости уровня приложения – репозиторий и навигатор – создаются в корневой функции и передаются вниз.</w:t>
       </w:r>
     </w:p>
     <w:p>
@@ -3002,6 +3138,7 @@
           <w:rFonts w:ascii="Courier New" w:eastAsia="Courier New" w:hAnsi="Courier New" w:cs="Courier New"/>
           <w:sz w:val="20"/>
         </w:rPr>
+        <w:lastRenderedPageBreak/>
         <w:t xml:space="preserve">    suspend fun getVendor(id: Int): Vendor</w:t>
       </w:r>
     </w:p>
@@ -3090,7 +3227,6 @@
         <w:rPr>
           <w:lang w:val="ru-RU"/>
         </w:rPr>
-        <w:lastRenderedPageBreak/>
         <w:t xml:space="preserve">3.2 </w:t>
       </w:r>
       <w:proofErr w:type="spellStart"/>
@@ -3157,9 +3293,6 @@
     <w:p>
       <w:pPr>
         <w:spacing w:line="240" w:lineRule="auto"/>
-        <w:rPr>
-          <w:lang w:val="ru-RU"/>
-        </w:rPr>
       </w:pPr>
       <w:r>
         <w:rPr>
@@ -3172,7 +3305,6 @@
         <w:rPr>
           <w:rFonts w:ascii="Courier New" w:eastAsia="Courier New" w:hAnsi="Courier New" w:cs="Courier New"/>
           <w:sz w:val="20"/>
-          <w:lang w:val="ru-RU"/>
         </w:rPr>
         <w:t xml:space="preserve"> </w:t>
       </w:r>
@@ -3189,7 +3321,6 @@
         <w:rPr>
           <w:rFonts w:ascii="Courier New" w:eastAsia="Courier New" w:hAnsi="Courier New" w:cs="Courier New"/>
           <w:sz w:val="20"/>
-          <w:lang w:val="ru-RU"/>
         </w:rPr>
         <w:t xml:space="preserve"> </w:t>
       </w:r>
@@ -3206,7 +3337,6 @@
         <w:rPr>
           <w:rFonts w:ascii="Courier New" w:eastAsia="Courier New" w:hAnsi="Courier New" w:cs="Courier New"/>
           <w:sz w:val="20"/>
-          <w:lang w:val="ru-RU"/>
         </w:rPr>
         <w:t xml:space="preserve">: </w:t>
       </w:r>
@@ -3221,7 +3351,6 @@
         <w:rPr>
           <w:rFonts w:ascii="Courier New" w:eastAsia="Courier New" w:hAnsi="Courier New" w:cs="Courier New"/>
           <w:sz w:val="20"/>
-          <w:lang w:val="ru-RU"/>
         </w:rPr>
         <w:t>&lt;</w:t>
       </w:r>
@@ -3236,7 +3365,6 @@
         <w:rPr>
           <w:rFonts w:ascii="Courier New" w:eastAsia="Courier New" w:hAnsi="Courier New" w:cs="Courier New"/>
           <w:sz w:val="20"/>
-          <w:lang w:val="ru-RU"/>
         </w:rPr>
         <w:t xml:space="preserve">&gt; = </w:t>
       </w:r>
@@ -3254,7 +3382,6 @@
         <w:rPr>
           <w:rFonts w:ascii="Courier New" w:eastAsia="Courier New" w:hAnsi="Courier New" w:cs="Courier New"/>
           <w:sz w:val="20"/>
-          <w:lang w:val="ru-RU"/>
         </w:rPr>
         <w:t>(</w:t>
       </w:r>
@@ -3268,7 +3395,6 @@
         <w:rPr>
           <w:rFonts w:ascii="Courier New" w:eastAsia="Courier New" w:hAnsi="Courier New" w:cs="Courier New"/>
           <w:sz w:val="20"/>
-          <w:lang w:val="ru-RU"/>
         </w:rPr>
         <w:t xml:space="preserve">    </w:t>
       </w:r>
@@ -3540,6 +3666,7 @@
         <w:rPr>
           <w:lang w:val="ru-RU"/>
         </w:rPr>
+        <w:lastRenderedPageBreak/>
         <w:t>4 ПОСТРОЕНИЕ ИНТЕРФЕЙСА</w:t>
       </w:r>
     </w:p>
@@ -3608,45 +3735,64 @@
       <w:pPr>
         <w:ind w:firstLine="709"/>
         <w:jc w:val="both"/>
-        <w:rPr>
-          <w:lang w:val="ru-RU"/>
-        </w:rPr>
-      </w:pPr>
-      <w:r>
-        <w:rPr>
-          <w:lang w:val="ru-RU"/>
-        </w:rPr>
-        <w:t xml:space="preserve">Состояние каталога содержит строку поискового запроса и список карточек, готовых к выводу: число загрузок уже сокращено, оценка округлена. Экран ничего не форматирует и доменную модель не видит, поэтому изменение способа показа затрагивает преобразователь, а не вёрстку. Реализация приведена в листинге 4.</w:t>
+      </w:pPr>
+      <w:r>
+        <w:rPr>
+          <w:lang w:val="ru-RU"/>
+        </w:rPr>
+        <w:t>Состояние каталога содержит строку поискового запроса и список карточек, готовых к выводу: число загрузок уже сокращено, оценка округлена. Экран ничего не форматирует и доменную модель не видит, поэтому изменение способа показа затрагивает преобразователь, а не вёрстку. Реализация</w:t>
+      </w:r>
+      <w:r>
+        <w:t xml:space="preserve"> </w:t>
+      </w:r>
+      <w:r>
+        <w:rPr>
+          <w:lang w:val="ru-RU"/>
+        </w:rPr>
+        <w:t>приведена</w:t>
+      </w:r>
+      <w:r>
+        <w:t xml:space="preserve"> </w:t>
+      </w:r>
+      <w:r>
+        <w:rPr>
+          <w:lang w:val="ru-RU"/>
+        </w:rPr>
+        <w:t>в</w:t>
+      </w:r>
+      <w:r>
+        <w:t xml:space="preserve"> </w:t>
+      </w:r>
+      <w:r>
+        <w:rPr>
+          <w:lang w:val="ru-RU"/>
+        </w:rPr>
+        <w:t>листинге</w:t>
+      </w:r>
+      <w:r>
+        <w:t xml:space="preserve"> 4.</w:t>
       </w:r>
     </w:p>
     <w:p>
       <w:pPr>
         <w:spacing w:line="240" w:lineRule="auto"/>
-        <w:rPr>
-          <w:lang w:val="ru-RU"/>
-        </w:rPr>
-      </w:pPr>
-      <w:r>
-        <w:rPr>
-          <w:rFonts w:ascii="Courier New" w:eastAsia="Courier New" w:hAnsi="Courier New" w:cs="Courier New"/>
-          <w:sz w:val="20"/>
-          <w:lang w:val="ru-RU"/>
-        </w:rPr>
-        <w:t xml:space="preserve">data class CatalogState(</w:t>
+      </w:pPr>
+      <w:r>
+        <w:rPr>
+          <w:rFonts w:ascii="Courier New" w:eastAsia="Courier New" w:hAnsi="Courier New" w:cs="Courier New"/>
+          <w:sz w:val="20"/>
+        </w:rPr>
+        <w:t>data class CatalogState(</w:t>
       </w:r>
     </w:p>
     <w:p>
       <w:pPr>
         <w:spacing w:line="240" w:lineRule="auto"/>
-        <w:rPr>
-          <w:lang w:val="ru-RU"/>
-        </w:rPr>
-      </w:pPr>
-      <w:r>
-        <w:rPr>
-          <w:rFonts w:ascii="Courier New" w:eastAsia="Courier New" w:hAnsi="Courier New" w:cs="Courier New"/>
-          <w:sz w:val="20"/>
-          <w:lang w:val="ru-RU"/>
+      </w:pPr>
+      <w:r>
+        <w:rPr>
+          <w:rFonts w:ascii="Courier New" w:eastAsia="Courier New" w:hAnsi="Courier New" w:cs="Courier New"/>
+          <w:sz w:val="20"/>
         </w:rPr>
         <w:t xml:space="preserve">    val query: String = "",</w:t>
       </w:r>
@@ -3654,15 +3800,11 @@
     <w:p>
       <w:pPr>
         <w:spacing w:line="240" w:lineRule="auto"/>
-        <w:rPr>
-          <w:lang w:val="ru-RU"/>
-        </w:rPr>
-      </w:pPr>
-      <w:r>
-        <w:rPr>
-          <w:rFonts w:ascii="Courier New" w:eastAsia="Courier New" w:hAnsi="Courier New" w:cs="Courier New"/>
-          <w:sz w:val="20"/>
-          <w:lang w:val="ru-RU"/>
+      </w:pPr>
+      <w:r>
+        <w:rPr>
+          <w:rFonts w:ascii="Courier New" w:eastAsia="Courier New" w:hAnsi="Courier New" w:cs="Courier New"/>
+          <w:sz w:val="20"/>
         </w:rPr>
         <w:t xml:space="preserve">    val items: List&lt;PluginCardUi&gt; = emptyList(),</w:t>
       </w:r>
@@ -3670,31 +3812,23 @@
     <w:p>
       <w:pPr>
         <w:spacing w:line="240" w:lineRule="auto"/>
-        <w:rPr>
-          <w:lang w:val="ru-RU"/>
-        </w:rPr>
-      </w:pPr>
-      <w:r>
-        <w:rPr>
-          <w:rFonts w:ascii="Courier New" w:eastAsia="Courier New" w:hAnsi="Courier New" w:cs="Courier New"/>
-          <w:sz w:val="20"/>
-          <w:lang w:val="ru-RU"/>
-        </w:rPr>
-        <w:t xml:space="preserve">)</w:t>
+      </w:pPr>
+      <w:r>
+        <w:rPr>
+          <w:rFonts w:ascii="Courier New" w:eastAsia="Courier New" w:hAnsi="Courier New" w:cs="Courier New"/>
+          <w:sz w:val="20"/>
+        </w:rPr>
+        <w:t>)</w:t>
       </w:r>
     </w:p>
     <w:p>
       <w:pPr>
         <w:spacing w:line="240" w:lineRule="auto"/>
-        <w:rPr>
-          <w:lang w:val="ru-RU"/>
-        </w:rPr>
-      </w:pPr>
-      <w:r>
-        <w:rPr>
-          <w:rFonts w:ascii="Courier New" w:eastAsia="Courier New" w:hAnsi="Courier New" w:cs="Courier New"/>
-          <w:sz w:val="20"/>
-          <w:lang w:val="ru-RU"/>
+      </w:pPr>
+      <w:r>
+        <w:rPr>
+          <w:rFonts w:ascii="Courier New" w:eastAsia="Courier New" w:hAnsi="Courier New" w:cs="Courier New"/>
+          <w:sz w:val="20"/>
         </w:rPr>
         <w:t xml:space="preserve"> </w:t>
       </w:r>
@@ -3702,31 +3836,23 @@
     <w:p>
       <w:pPr>
         <w:spacing w:line="240" w:lineRule="auto"/>
-        <w:rPr>
-          <w:lang w:val="ru-RU"/>
-        </w:rPr>
-      </w:pPr>
-      <w:r>
-        <w:rPr>
-          <w:rFonts w:ascii="Courier New" w:eastAsia="Courier New" w:hAnsi="Courier New" w:cs="Courier New"/>
-          <w:sz w:val="20"/>
-          <w:lang w:val="ru-RU"/>
-        </w:rPr>
-        <w:t xml:space="preserve">sealed interface CatalogIntent {</w:t>
+      </w:pPr>
+      <w:r>
+        <w:rPr>
+          <w:rFonts w:ascii="Courier New" w:eastAsia="Courier New" w:hAnsi="Courier New" w:cs="Courier New"/>
+          <w:sz w:val="20"/>
+        </w:rPr>
+        <w:t>sealed interface CatalogIntent {</w:t>
       </w:r>
     </w:p>
     <w:p>
       <w:pPr>
         <w:spacing w:line="240" w:lineRule="auto"/>
-        <w:rPr>
-          <w:lang w:val="ru-RU"/>
-        </w:rPr>
-      </w:pPr>
-      <w:r>
-        <w:rPr>
-          <w:rFonts w:ascii="Courier New" w:eastAsia="Courier New" w:hAnsi="Courier New" w:cs="Courier New"/>
-          <w:sz w:val="20"/>
-          <w:lang w:val="ru-RU"/>
+      </w:pPr>
+      <w:r>
+        <w:rPr>
+          <w:rFonts w:ascii="Courier New" w:eastAsia="Courier New" w:hAnsi="Courier New" w:cs="Courier New"/>
+          <w:sz w:val="20"/>
         </w:rPr>
         <w:t xml:space="preserve">    data class QueryChanged(val query: String) : CatalogIntent</w:t>
       </w:r>
@@ -3734,15 +3860,11 @@
     <w:p>
       <w:pPr>
         <w:spacing w:line="240" w:lineRule="auto"/>
-        <w:rPr>
-          <w:lang w:val="ru-RU"/>
-        </w:rPr>
-      </w:pPr>
-      <w:r>
-        <w:rPr>
-          <w:rFonts w:ascii="Courier New" w:eastAsia="Courier New" w:hAnsi="Courier New" w:cs="Courier New"/>
-          <w:sz w:val="20"/>
-          <w:lang w:val="ru-RU"/>
+      </w:pPr>
+      <w:r>
+        <w:rPr>
+          <w:rFonts w:ascii="Courier New" w:eastAsia="Courier New" w:hAnsi="Courier New" w:cs="Courier New"/>
+          <w:sz w:val="20"/>
         </w:rPr>
         <w:t xml:space="preserve">    data class PluginClicked(val pluginId: Int) : CatalogIntent</w:t>
       </w:r>
@@ -3750,31 +3872,23 @@
     <w:p>
       <w:pPr>
         <w:spacing w:line="240" w:lineRule="auto"/>
-        <w:rPr>
-          <w:lang w:val="ru-RU"/>
-        </w:rPr>
-      </w:pPr>
-      <w:r>
-        <w:rPr>
-          <w:rFonts w:ascii="Courier New" w:eastAsia="Courier New" w:hAnsi="Courier New" w:cs="Courier New"/>
-          <w:sz w:val="20"/>
-          <w:lang w:val="ru-RU"/>
-        </w:rPr>
-        <w:t xml:space="preserve">}</w:t>
+      </w:pPr>
+      <w:r>
+        <w:rPr>
+          <w:rFonts w:ascii="Courier New" w:eastAsia="Courier New" w:hAnsi="Courier New" w:cs="Courier New"/>
+          <w:sz w:val="20"/>
+        </w:rPr>
+        <w:t>}</w:t>
       </w:r>
     </w:p>
     <w:p>
       <w:pPr>
         <w:spacing w:line="240" w:lineRule="auto"/>
-        <w:rPr>
-          <w:lang w:val="ru-RU"/>
-        </w:rPr>
-      </w:pPr>
-      <w:r>
-        <w:rPr>
-          <w:rFonts w:ascii="Courier New" w:eastAsia="Courier New" w:hAnsi="Courier New" w:cs="Courier New"/>
-          <w:sz w:val="20"/>
-          <w:lang w:val="ru-RU"/>
+      </w:pPr>
+      <w:r>
+        <w:rPr>
+          <w:rFonts w:ascii="Courier New" w:eastAsia="Courier New" w:hAnsi="Courier New" w:cs="Courier New"/>
+          <w:sz w:val="20"/>
         </w:rPr>
         <w:t xml:space="preserve"> </w:t>
       </w:r>
@@ -3782,31 +3896,23 @@
     <w:p>
       <w:pPr>
         <w:spacing w:line="240" w:lineRule="auto"/>
-        <w:rPr>
-          <w:lang w:val="ru-RU"/>
-        </w:rPr>
-      </w:pPr>
-      <w:r>
-        <w:rPr>
-          <w:rFonts w:ascii="Courier New" w:eastAsia="Courier New" w:hAnsi="Courier New" w:cs="Courier New"/>
-          <w:sz w:val="20"/>
-          <w:lang w:val="ru-RU"/>
-        </w:rPr>
-        <w:t xml:space="preserve">class CatalogViewModel(</w:t>
+      </w:pPr>
+      <w:r>
+        <w:rPr>
+          <w:rFonts w:ascii="Courier New" w:eastAsia="Courier New" w:hAnsi="Courier New" w:cs="Courier New"/>
+          <w:sz w:val="20"/>
+        </w:rPr>
+        <w:t>class CatalogViewModel(</w:t>
       </w:r>
     </w:p>
     <w:p>
       <w:pPr>
         <w:spacing w:line="240" w:lineRule="auto"/>
-        <w:rPr>
-          <w:lang w:val="ru-RU"/>
-        </w:rPr>
-      </w:pPr>
-      <w:r>
-        <w:rPr>
-          <w:rFonts w:ascii="Courier New" w:eastAsia="Courier New" w:hAnsi="Courier New" w:cs="Courier New"/>
-          <w:sz w:val="20"/>
-          <w:lang w:val="ru-RU"/>
+      </w:pPr>
+      <w:r>
+        <w:rPr>
+          <w:rFonts w:ascii="Courier New" w:eastAsia="Courier New" w:hAnsi="Courier New" w:cs="Courier New"/>
+          <w:sz w:val="20"/>
         </w:rPr>
         <w:t xml:space="preserve">    private val navigator: Navigator,</w:t>
       </w:r>
@@ -3814,15 +3920,11 @@
     <w:p>
       <w:pPr>
         <w:spacing w:line="240" w:lineRule="auto"/>
-        <w:rPr>
-          <w:lang w:val="ru-RU"/>
-        </w:rPr>
-      </w:pPr>
-      <w:r>
-        <w:rPr>
-          <w:rFonts w:ascii="Courier New" w:eastAsia="Courier New" w:hAnsi="Courier New" w:cs="Courier New"/>
-          <w:sz w:val="20"/>
-          <w:lang w:val="ru-RU"/>
+      </w:pPr>
+      <w:r>
+        <w:rPr>
+          <w:rFonts w:ascii="Courier New" w:eastAsia="Courier New" w:hAnsi="Courier New" w:cs="Courier New"/>
+          <w:sz w:val="20"/>
         </w:rPr>
         <w:t xml:space="preserve">    private val repository: CatalogRepository,</w:t>
       </w:r>
@@ -3830,31 +3932,23 @@
     <w:p>
       <w:pPr>
         <w:spacing w:line="240" w:lineRule="auto"/>
-        <w:rPr>
-          <w:lang w:val="ru-RU"/>
-        </w:rPr>
-      </w:pPr>
-      <w:r>
-        <w:rPr>
-          <w:rFonts w:ascii="Courier New" w:eastAsia="Courier New" w:hAnsi="Courier New" w:cs="Courier New"/>
-          <w:sz w:val="20"/>
-          <w:lang w:val="ru-RU"/>
-        </w:rPr>
-        <w:t xml:space="preserve">) : ViewModel() {</w:t>
+      </w:pPr>
+      <w:r>
+        <w:rPr>
+          <w:rFonts w:ascii="Courier New" w:eastAsia="Courier New" w:hAnsi="Courier New" w:cs="Courier New"/>
+          <w:sz w:val="20"/>
+        </w:rPr>
+        <w:t>) : ViewModel() {</w:t>
       </w:r>
     </w:p>
     <w:p>
       <w:pPr>
         <w:spacing w:line="240" w:lineRule="auto"/>
-        <w:rPr>
-          <w:lang w:val="ru-RU"/>
-        </w:rPr>
-      </w:pPr>
-      <w:r>
-        <w:rPr>
-          <w:rFonts w:ascii="Courier New" w:eastAsia="Courier New" w:hAnsi="Courier New" w:cs="Courier New"/>
-          <w:sz w:val="20"/>
-          <w:lang w:val="ru-RU"/>
+      </w:pPr>
+      <w:r>
+        <w:rPr>
+          <w:rFonts w:ascii="Courier New" w:eastAsia="Courier New" w:hAnsi="Courier New" w:cs="Courier New"/>
+          <w:sz w:val="20"/>
         </w:rPr>
         <w:t xml:space="preserve"> </w:t>
       </w:r>
@@ -3862,15 +3956,11 @@
     <w:p>
       <w:pPr>
         <w:spacing w:line="240" w:lineRule="auto"/>
-        <w:rPr>
-          <w:lang w:val="ru-RU"/>
-        </w:rPr>
-      </w:pPr>
-      <w:r>
-        <w:rPr>
-          <w:rFonts w:ascii="Courier New" w:eastAsia="Courier New" w:hAnsi="Courier New" w:cs="Courier New"/>
-          <w:sz w:val="20"/>
-          <w:lang w:val="ru-RU"/>
+      </w:pPr>
+      <w:r>
+        <w:rPr>
+          <w:rFonts w:ascii="Courier New" w:eastAsia="Courier New" w:hAnsi="Courier New" w:cs="Courier New"/>
+          <w:sz w:val="20"/>
         </w:rPr>
         <w:t xml:space="preserve">    private val allItems = MutableStateFlow&lt;List&lt;PluginCardUi&gt;&gt;(emptyList())</w:t>
       </w:r>
@@ -3878,15 +3968,11 @@
     <w:p>
       <w:pPr>
         <w:spacing w:line="240" w:lineRule="auto"/>
-        <w:rPr>
-          <w:lang w:val="ru-RU"/>
-        </w:rPr>
-      </w:pPr>
-      <w:r>
-        <w:rPr>
-          <w:rFonts w:ascii="Courier New" w:eastAsia="Courier New" w:hAnsi="Courier New" w:cs="Courier New"/>
-          <w:sz w:val="20"/>
-          <w:lang w:val="ru-RU"/>
+      </w:pPr>
+      <w:r>
+        <w:rPr>
+          <w:rFonts w:ascii="Courier New" w:eastAsia="Courier New" w:hAnsi="Courier New" w:cs="Courier New"/>
+          <w:sz w:val="20"/>
         </w:rPr>
         <w:t xml:space="preserve">    private val query = MutableStateFlow("")</w:t>
       </w:r>
@@ -3894,15 +3980,11 @@
     <w:p>
       <w:pPr>
         <w:spacing w:line="240" w:lineRule="auto"/>
-        <w:rPr>
-          <w:lang w:val="ru-RU"/>
-        </w:rPr>
-      </w:pPr>
-      <w:r>
-        <w:rPr>
-          <w:rFonts w:ascii="Courier New" w:eastAsia="Courier New" w:hAnsi="Courier New" w:cs="Courier New"/>
-          <w:sz w:val="20"/>
-          <w:lang w:val="ru-RU"/>
+      </w:pPr>
+      <w:r>
+        <w:rPr>
+          <w:rFonts w:ascii="Courier New" w:eastAsia="Courier New" w:hAnsi="Courier New" w:cs="Courier New"/>
+          <w:sz w:val="20"/>
         </w:rPr>
         <w:t xml:space="preserve"> </w:t>
       </w:r>
@@ -3910,15 +3992,11 @@
     <w:p>
       <w:pPr>
         <w:spacing w:line="240" w:lineRule="auto"/>
-        <w:rPr>
-          <w:lang w:val="ru-RU"/>
-        </w:rPr>
-      </w:pPr>
-      <w:r>
-        <w:rPr>
-          <w:rFonts w:ascii="Courier New" w:eastAsia="Courier New" w:hAnsi="Courier New" w:cs="Courier New"/>
-          <w:sz w:val="20"/>
-          <w:lang w:val="ru-RU"/>
+      </w:pPr>
+      <w:r>
+        <w:rPr>
+          <w:rFonts w:ascii="Courier New" w:eastAsia="Courier New" w:hAnsi="Courier New" w:cs="Courier New"/>
+          <w:sz w:val="20"/>
         </w:rPr>
         <w:t xml:space="preserve">    val state: StateFlow&lt;CatalogState&gt; =</w:t>
       </w:r>
@@ -3926,15 +4004,11 @@
     <w:p>
       <w:pPr>
         <w:spacing w:line="240" w:lineRule="auto"/>
-        <w:rPr>
-          <w:lang w:val="ru-RU"/>
-        </w:rPr>
-      </w:pPr>
-      <w:r>
-        <w:rPr>
-          <w:rFonts w:ascii="Courier New" w:eastAsia="Courier New" w:hAnsi="Courier New" w:cs="Courier New"/>
-          <w:sz w:val="20"/>
-          <w:lang w:val="ru-RU"/>
+      </w:pPr>
+      <w:r>
+        <w:rPr>
+          <w:rFonts w:ascii="Courier New" w:eastAsia="Courier New" w:hAnsi="Courier New" w:cs="Courier New"/>
+          <w:sz w:val="20"/>
         </w:rPr>
         <w:t xml:space="preserve">        combine(allItems, query) { items, query -&gt;</w:t>
       </w:r>
@@ -3942,15 +4016,11 @@
     <w:p>
       <w:pPr>
         <w:spacing w:line="240" w:lineRule="auto"/>
-        <w:rPr>
-          <w:lang w:val="ru-RU"/>
-        </w:rPr>
-      </w:pPr>
-      <w:r>
-        <w:rPr>
-          <w:rFonts w:ascii="Courier New" w:eastAsia="Courier New" w:hAnsi="Courier New" w:cs="Courier New"/>
-          <w:sz w:val="20"/>
-          <w:lang w:val="ru-RU"/>
+      </w:pPr>
+      <w:r>
+        <w:rPr>
+          <w:rFonts w:ascii="Courier New" w:eastAsia="Courier New" w:hAnsi="Courier New" w:cs="Courier New"/>
+          <w:sz w:val="20"/>
         </w:rPr>
         <w:t xml:space="preserve">            CatalogState(query = query, items = items.filterByName(query))</w:t>
       </w:r>
@@ -3958,15 +4028,11 @@
     <w:p>
       <w:pPr>
         <w:spacing w:line="240" w:lineRule="auto"/>
-        <w:rPr>
-          <w:lang w:val="ru-RU"/>
-        </w:rPr>
-      </w:pPr>
-      <w:r>
-        <w:rPr>
-          <w:rFonts w:ascii="Courier New" w:eastAsia="Courier New" w:hAnsi="Courier New" w:cs="Courier New"/>
-          <w:sz w:val="20"/>
-          <w:lang w:val="ru-RU"/>
+      </w:pPr>
+      <w:r>
+        <w:rPr>
+          <w:rFonts w:ascii="Courier New" w:eastAsia="Courier New" w:hAnsi="Courier New" w:cs="Courier New"/>
+          <w:sz w:val="20"/>
         </w:rPr>
         <w:t xml:space="preserve">        }.stateIn(viewModelScope, SharingStarted.Eagerly, CatalogState())</w:t>
       </w:r>
@@ -3974,15 +4040,11 @@
     <w:p>
       <w:pPr>
         <w:spacing w:line="240" w:lineRule="auto"/>
-        <w:rPr>
-          <w:lang w:val="ru-RU"/>
-        </w:rPr>
-      </w:pPr>
-      <w:r>
-        <w:rPr>
-          <w:rFonts w:ascii="Courier New" w:eastAsia="Courier New" w:hAnsi="Courier New" w:cs="Courier New"/>
-          <w:sz w:val="20"/>
-          <w:lang w:val="ru-RU"/>
+      </w:pPr>
+      <w:r>
+        <w:rPr>
+          <w:rFonts w:ascii="Courier New" w:eastAsia="Courier New" w:hAnsi="Courier New" w:cs="Courier New"/>
+          <w:sz w:val="20"/>
         </w:rPr>
         <w:t xml:space="preserve"> </w:t>
       </w:r>
@@ -3990,15 +4052,11 @@
     <w:p>
       <w:pPr>
         <w:spacing w:line="240" w:lineRule="auto"/>
-        <w:rPr>
-          <w:lang w:val="ru-RU"/>
-        </w:rPr>
-      </w:pPr>
-      <w:r>
-        <w:rPr>
-          <w:rFonts w:ascii="Courier New" w:eastAsia="Courier New" w:hAnsi="Courier New" w:cs="Courier New"/>
-          <w:sz w:val="20"/>
-          <w:lang w:val="ru-RU"/>
+      </w:pPr>
+      <w:r>
+        <w:rPr>
+          <w:rFonts w:ascii="Courier New" w:eastAsia="Courier New" w:hAnsi="Courier New" w:cs="Courier New"/>
+          <w:sz w:val="20"/>
         </w:rPr>
         <w:t xml:space="preserve">    init {</w:t>
       </w:r>
@@ -4006,15 +4064,11 @@
     <w:p>
       <w:pPr>
         <w:spacing w:line="240" w:lineRule="auto"/>
-        <w:rPr>
-          <w:lang w:val="ru-RU"/>
-        </w:rPr>
-      </w:pPr>
-      <w:r>
-        <w:rPr>
-          <w:rFonts w:ascii="Courier New" w:eastAsia="Courier New" w:hAnsi="Courier New" w:cs="Courier New"/>
-          <w:sz w:val="20"/>
-          <w:lang w:val="ru-RU"/>
+      </w:pPr>
+      <w:r>
+        <w:rPr>
+          <w:rFonts w:ascii="Courier New" w:eastAsia="Courier New" w:hAnsi="Courier New" w:cs="Courier New"/>
+          <w:sz w:val="20"/>
         </w:rPr>
         <w:t xml:space="preserve">        viewModelScope.launch {</w:t>
       </w:r>
@@ -4022,15 +4076,11 @@
     <w:p>
       <w:pPr>
         <w:spacing w:line="240" w:lineRule="auto"/>
-        <w:rPr>
-          <w:lang w:val="ru-RU"/>
-        </w:rPr>
-      </w:pPr>
-      <w:r>
-        <w:rPr>
-          <w:rFonts w:ascii="Courier New" w:eastAsia="Courier New" w:hAnsi="Courier New" w:cs="Courier New"/>
-          <w:sz w:val="20"/>
-          <w:lang w:val="ru-RU"/>
+      </w:pPr>
+      <w:r>
+        <w:rPr>
+          <w:rFonts w:ascii="Courier New" w:eastAsia="Courier New" w:hAnsi="Courier New" w:cs="Courier New"/>
+          <w:sz w:val="20"/>
         </w:rPr>
         <w:t xml:space="preserve">            val plugins = repository.getPlugins()</w:t>
       </w:r>
@@ -4038,15 +4088,11 @@
     <w:p>
       <w:pPr>
         <w:spacing w:line="240" w:lineRule="auto"/>
-        <w:rPr>
-          <w:lang w:val="ru-RU"/>
-        </w:rPr>
-      </w:pPr>
-      <w:r>
-        <w:rPr>
-          <w:rFonts w:ascii="Courier New" w:eastAsia="Courier New" w:hAnsi="Courier New" w:cs="Courier New"/>
-          <w:sz w:val="20"/>
-          <w:lang w:val="ru-RU"/>
+      </w:pPr>
+      <w:r>
+        <w:rPr>
+          <w:rFonts w:ascii="Courier New" w:eastAsia="Courier New" w:hAnsi="Courier New" w:cs="Courier New"/>
+          <w:sz w:val="20"/>
         </w:rPr>
         <w:t xml:space="preserve">            allItems.value = repository.toCards(plugins)</w:t>
       </w:r>
@@ -4054,15 +4100,11 @@
     <w:p>
       <w:pPr>
         <w:spacing w:line="240" w:lineRule="auto"/>
-        <w:rPr>
-          <w:lang w:val="ru-RU"/>
-        </w:rPr>
-      </w:pPr>
-      <w:r>
-        <w:rPr>
-          <w:rFonts w:ascii="Courier New" w:eastAsia="Courier New" w:hAnsi="Courier New" w:cs="Courier New"/>
-          <w:sz w:val="20"/>
-          <w:lang w:val="ru-RU"/>
+      </w:pPr>
+      <w:r>
+        <w:rPr>
+          <w:rFonts w:ascii="Courier New" w:eastAsia="Courier New" w:hAnsi="Courier New" w:cs="Courier New"/>
+          <w:sz w:val="20"/>
         </w:rPr>
         <w:t xml:space="preserve">        }</w:t>
       </w:r>
@@ -4070,15 +4112,11 @@
     <w:p>
       <w:pPr>
         <w:spacing w:line="240" w:lineRule="auto"/>
-        <w:rPr>
-          <w:lang w:val="ru-RU"/>
-        </w:rPr>
-      </w:pPr>
-      <w:r>
-        <w:rPr>
-          <w:rFonts w:ascii="Courier New" w:eastAsia="Courier New" w:hAnsi="Courier New" w:cs="Courier New"/>
-          <w:sz w:val="20"/>
-          <w:lang w:val="ru-RU"/>
+      </w:pPr>
+      <w:r>
+        <w:rPr>
+          <w:rFonts w:ascii="Courier New" w:eastAsia="Courier New" w:hAnsi="Courier New" w:cs="Courier New"/>
+          <w:sz w:val="20"/>
         </w:rPr>
         <w:t xml:space="preserve">    }</w:t>
       </w:r>
@@ -4086,15 +4124,11 @@
     <w:p>
       <w:pPr>
         <w:spacing w:line="240" w:lineRule="auto"/>
-        <w:rPr>
-          <w:lang w:val="ru-RU"/>
-        </w:rPr>
-      </w:pPr>
-      <w:r>
-        <w:rPr>
-          <w:rFonts w:ascii="Courier New" w:eastAsia="Courier New" w:hAnsi="Courier New" w:cs="Courier New"/>
-          <w:sz w:val="20"/>
-          <w:lang w:val="ru-RU"/>
+      </w:pPr>
+      <w:r>
+        <w:rPr>
+          <w:rFonts w:ascii="Courier New" w:eastAsia="Courier New" w:hAnsi="Courier New" w:cs="Courier New"/>
+          <w:sz w:val="20"/>
         </w:rPr>
         <w:t xml:space="preserve"> </w:t>
       </w:r>
@@ -4102,15 +4136,11 @@
     <w:p>
       <w:pPr>
         <w:spacing w:line="240" w:lineRule="auto"/>
-        <w:rPr>
-          <w:lang w:val="ru-RU"/>
-        </w:rPr>
-      </w:pPr>
-      <w:r>
-        <w:rPr>
-          <w:rFonts w:ascii="Courier New" w:eastAsia="Courier New" w:hAnsi="Courier New" w:cs="Courier New"/>
-          <w:sz w:val="20"/>
-          <w:lang w:val="ru-RU"/>
+      </w:pPr>
+      <w:r>
+        <w:rPr>
+          <w:rFonts w:ascii="Courier New" w:eastAsia="Courier New" w:hAnsi="Courier New" w:cs="Courier New"/>
+          <w:sz w:val="20"/>
         </w:rPr>
         <w:t xml:space="preserve">    fun onIntent(intent: CatalogIntent) {</w:t>
       </w:r>
@@ -4118,15 +4148,11 @@
     <w:p>
       <w:pPr>
         <w:spacing w:line="240" w:lineRule="auto"/>
-        <w:rPr>
-          <w:lang w:val="ru-RU"/>
-        </w:rPr>
-      </w:pPr>
-      <w:r>
-        <w:rPr>
-          <w:rFonts w:ascii="Courier New" w:eastAsia="Courier New" w:hAnsi="Courier New" w:cs="Courier New"/>
-          <w:sz w:val="20"/>
-          <w:lang w:val="ru-RU"/>
+      </w:pPr>
+      <w:r>
+        <w:rPr>
+          <w:rFonts w:ascii="Courier New" w:eastAsia="Courier New" w:hAnsi="Courier New" w:cs="Courier New"/>
+          <w:sz w:val="20"/>
         </w:rPr>
         <w:t xml:space="preserve">        when (intent) {</w:t>
       </w:r>
@@ -4134,15 +4160,11 @@
     <w:p>
       <w:pPr>
         <w:spacing w:line="240" w:lineRule="auto"/>
-        <w:rPr>
-          <w:lang w:val="ru-RU"/>
-        </w:rPr>
-      </w:pPr>
-      <w:r>
-        <w:rPr>
-          <w:rFonts w:ascii="Courier New" w:eastAsia="Courier New" w:hAnsi="Courier New" w:cs="Courier New"/>
-          <w:sz w:val="20"/>
-          <w:lang w:val="ru-RU"/>
+      </w:pPr>
+      <w:r>
+        <w:rPr>
+          <w:rFonts w:ascii="Courier New" w:eastAsia="Courier New" w:hAnsi="Courier New" w:cs="Courier New"/>
+          <w:sz w:val="20"/>
         </w:rPr>
         <w:t xml:space="preserve">            is CatalogIntent.QueryChanged -&gt; query.update { intent.query }</w:t>
       </w:r>
@@ -4150,15 +4172,11 @@
     <w:p>
       <w:pPr>
         <w:spacing w:line="240" w:lineRule="auto"/>
-        <w:rPr>
-          <w:lang w:val="ru-RU"/>
-        </w:rPr>
-      </w:pPr>
-      <w:r>
-        <w:rPr>
-          <w:rFonts w:ascii="Courier New" w:eastAsia="Courier New" w:hAnsi="Courier New" w:cs="Courier New"/>
-          <w:sz w:val="20"/>
-          <w:lang w:val="ru-RU"/>
+      </w:pPr>
+      <w:r>
+        <w:rPr>
+          <w:rFonts w:ascii="Courier New" w:eastAsia="Courier New" w:hAnsi="Courier New" w:cs="Courier New"/>
+          <w:sz w:val="20"/>
         </w:rPr>
         <w:t xml:space="preserve">            is CatalogIntent.PluginClicked -&gt;</w:t>
       </w:r>
@@ -4166,15 +4184,11 @@
     <w:p>
       <w:pPr>
         <w:spacing w:line="240" w:lineRule="auto"/>
-        <w:rPr>
-          <w:lang w:val="ru-RU"/>
-        </w:rPr>
-      </w:pPr>
-      <w:r>
-        <w:rPr>
-          <w:rFonts w:ascii="Courier New" w:eastAsia="Courier New" w:hAnsi="Courier New" w:cs="Courier New"/>
-          <w:sz w:val="20"/>
-          <w:lang w:val="ru-RU"/>
+      </w:pPr>
+      <w:r>
+        <w:rPr>
+          <w:rFonts w:ascii="Courier New" w:eastAsia="Courier New" w:hAnsi="Courier New" w:cs="Courier New"/>
+          <w:sz w:val="20"/>
         </w:rPr>
         <w:t xml:space="preserve">                navigator.open(Screen.PluginDetail(intent.pluginId))</w:t>
       </w:r>
@@ -4182,15 +4196,11 @@
     <w:p>
       <w:pPr>
         <w:spacing w:line="240" w:lineRule="auto"/>
-        <w:rPr>
-          <w:lang w:val="ru-RU"/>
-        </w:rPr>
-      </w:pPr>
-      <w:r>
-        <w:rPr>
-          <w:rFonts w:ascii="Courier New" w:eastAsia="Courier New" w:hAnsi="Courier New" w:cs="Courier New"/>
-          <w:sz w:val="20"/>
-          <w:lang w:val="ru-RU"/>
+      </w:pPr>
+      <w:r>
+        <w:rPr>
+          <w:rFonts w:ascii="Courier New" w:eastAsia="Courier New" w:hAnsi="Courier New" w:cs="Courier New"/>
+          <w:sz w:val="20"/>
         </w:rPr>
         <w:t xml:space="preserve">        }</w:t>
       </w:r>
@@ -4198,15 +4208,11 @@
     <w:p>
       <w:pPr>
         <w:spacing w:line="240" w:lineRule="auto"/>
-        <w:rPr>
-          <w:lang w:val="ru-RU"/>
-        </w:rPr>
-      </w:pPr>
-      <w:r>
-        <w:rPr>
-          <w:rFonts w:ascii="Courier New" w:eastAsia="Courier New" w:hAnsi="Courier New" w:cs="Courier New"/>
-          <w:sz w:val="20"/>
-          <w:lang w:val="ru-RU"/>
+      </w:pPr>
+      <w:r>
+        <w:rPr>
+          <w:rFonts w:ascii="Courier New" w:eastAsia="Courier New" w:hAnsi="Courier New" w:cs="Courier New"/>
+          <w:sz w:val="20"/>
         </w:rPr>
         <w:t xml:space="preserve">    }</w:t>
       </w:r>
@@ -4214,31 +4220,24 @@
     <w:p>
       <w:pPr>
         <w:spacing w:line="240" w:lineRule="auto"/>
-        <w:rPr>
-          <w:lang w:val="ru-RU"/>
-        </w:rPr>
-      </w:pPr>
-      <w:r>
-        <w:rPr>
-          <w:rFonts w:ascii="Courier New" w:eastAsia="Courier New" w:hAnsi="Courier New" w:cs="Courier New"/>
-          <w:sz w:val="20"/>
-          <w:lang w:val="ru-RU"/>
-        </w:rPr>
+      </w:pPr>
+      <w:r>
+        <w:rPr>
+          <w:rFonts w:ascii="Courier New" w:eastAsia="Courier New" w:hAnsi="Courier New" w:cs="Courier New"/>
+          <w:sz w:val="20"/>
+        </w:rPr>
+        <w:lastRenderedPageBreak/>
         <w:t xml:space="preserve"> </w:t>
       </w:r>
     </w:p>
     <w:p>
       <w:pPr>
         <w:spacing w:line="240" w:lineRule="auto"/>
-        <w:rPr>
-          <w:lang w:val="ru-RU"/>
-        </w:rPr>
-      </w:pPr>
-      <w:r>
-        <w:rPr>
-          <w:rFonts w:ascii="Courier New" w:eastAsia="Courier New" w:hAnsi="Courier New" w:cs="Courier New"/>
-          <w:sz w:val="20"/>
-          <w:lang w:val="ru-RU"/>
+      </w:pPr>
+      <w:r>
+        <w:rPr>
+          <w:rFonts w:ascii="Courier New" w:eastAsia="Courier New" w:hAnsi="Courier New" w:cs="Courier New"/>
+          <w:sz w:val="20"/>
         </w:rPr>
         <w:t xml:space="preserve">    private fun List&lt;PluginCardUi&gt;.filterByName(</w:t>
       </w:r>
@@ -4246,15 +4245,11 @@
     <w:p>
       <w:pPr>
         <w:spacing w:line="240" w:lineRule="auto"/>
-        <w:rPr>
-          <w:lang w:val="ru-RU"/>
-        </w:rPr>
-      </w:pPr>
-      <w:r>
-        <w:rPr>
-          <w:rFonts w:ascii="Courier New" w:eastAsia="Courier New" w:hAnsi="Courier New" w:cs="Courier New"/>
-          <w:sz w:val="20"/>
-          <w:lang w:val="ru-RU"/>
+      </w:pPr>
+      <w:r>
+        <w:rPr>
+          <w:rFonts w:ascii="Courier New" w:eastAsia="Courier New" w:hAnsi="Courier New" w:cs="Courier New"/>
+          <w:sz w:val="20"/>
         </w:rPr>
         <w:t xml:space="preserve">        query: String,</w:t>
       </w:r>
@@ -4262,15 +4257,11 @@
     <w:p>
       <w:pPr>
         <w:spacing w:line="240" w:lineRule="auto"/>
-        <w:rPr>
-          <w:lang w:val="ru-RU"/>
-        </w:rPr>
-      </w:pPr>
-      <w:r>
-        <w:rPr>
-          <w:rFonts w:ascii="Courier New" w:eastAsia="Courier New" w:hAnsi="Courier New" w:cs="Courier New"/>
-          <w:sz w:val="20"/>
-          <w:lang w:val="ru-RU"/>
+      </w:pPr>
+      <w:r>
+        <w:rPr>
+          <w:rFonts w:ascii="Courier New" w:eastAsia="Courier New" w:hAnsi="Courier New" w:cs="Courier New"/>
+          <w:sz w:val="20"/>
         </w:rPr>
         <w:t xml:space="preserve">    ): List&lt;PluginCardUi&gt; {</w:t>
       </w:r>
@@ -4278,15 +4269,11 @@
     <w:p>
       <w:pPr>
         <w:spacing w:line="240" w:lineRule="auto"/>
-        <w:rPr>
-          <w:lang w:val="ru-RU"/>
-        </w:rPr>
-      </w:pPr>
-      <w:r>
-        <w:rPr>
-          <w:rFonts w:ascii="Courier New" w:eastAsia="Courier New" w:hAnsi="Courier New" w:cs="Courier New"/>
-          <w:sz w:val="20"/>
-          <w:lang w:val="ru-RU"/>
+      </w:pPr>
+      <w:r>
+        <w:rPr>
+          <w:rFonts w:ascii="Courier New" w:eastAsia="Courier New" w:hAnsi="Courier New" w:cs="Courier New"/>
+          <w:sz w:val="20"/>
         </w:rPr>
         <w:t xml:space="preserve">        val needle = query.trim()</w:t>
       </w:r>
@@ -4294,15 +4281,11 @@
     <w:p>
       <w:pPr>
         <w:spacing w:line="240" w:lineRule="auto"/>
-        <w:rPr>
-          <w:lang w:val="ru-RU"/>
-        </w:rPr>
-      </w:pPr>
-      <w:r>
-        <w:rPr>
-          <w:rFonts w:ascii="Courier New" w:eastAsia="Courier New" w:hAnsi="Courier New" w:cs="Courier New"/>
-          <w:sz w:val="20"/>
-          <w:lang w:val="ru-RU"/>
+      </w:pPr>
+      <w:r>
+        <w:rPr>
+          <w:rFonts w:ascii="Courier New" w:eastAsia="Courier New" w:hAnsi="Courier New" w:cs="Courier New"/>
+          <w:sz w:val="20"/>
         </w:rPr>
         <w:t xml:space="preserve">        if (needle.isEmpty()) return this</w:t>
       </w:r>
@@ -4310,15 +4293,11 @@
     <w:p>
       <w:pPr>
         <w:spacing w:line="240" w:lineRule="auto"/>
-        <w:rPr>
-          <w:lang w:val="ru-RU"/>
-        </w:rPr>
-      </w:pPr>
-      <w:r>
-        <w:rPr>
-          <w:rFonts w:ascii="Courier New" w:eastAsia="Courier New" w:hAnsi="Courier New" w:cs="Courier New"/>
-          <w:sz w:val="20"/>
-          <w:lang w:val="ru-RU"/>
+      </w:pPr>
+      <w:r>
+        <w:rPr>
+          <w:rFonts w:ascii="Courier New" w:eastAsia="Courier New" w:hAnsi="Courier New" w:cs="Courier New"/>
+          <w:sz w:val="20"/>
         </w:rPr>
         <w:t xml:space="preserve">        return filter { it.name.contains(needle, ignoreCase = true) }</w:t>
       </w:r>
@@ -4334,9 +4313,16 @@
         <w:rPr>
           <w:rFonts w:ascii="Courier New" w:eastAsia="Courier New" w:hAnsi="Courier New" w:cs="Courier New"/>
           <w:sz w:val="20"/>
-          <w:lang w:val="ru-RU"/>
-        </w:rPr>
-        <w:t xml:space="preserve">    }</w:t>
+        </w:rPr>
+        <w:t xml:space="preserve">    </w:t>
+      </w:r>
+      <w:r>
+        <w:rPr>
+          <w:rFonts w:ascii="Courier New" w:eastAsia="Courier New" w:hAnsi="Courier New" w:cs="Courier New"/>
+          <w:sz w:val="20"/>
+          <w:lang w:val="ru-RU"/>
+        </w:rPr>
+        <w:t>}</w:t>
       </w:r>
     </w:p>
     <w:p>
@@ -4352,7 +4338,7 @@
           <w:sz w:val="20"/>
           <w:lang w:val="ru-RU"/>
         </w:rPr>
-        <w:t xml:space="preserve">}</w:t>
+        <w:t>}</w:t>
       </w:r>
     </w:p>
     <w:p>
@@ -4398,7 +4384,7 @@
         <w:rPr>
           <w:lang w:val="ru-RU"/>
         </w:rPr>
-        <w:t xml:space="preserve">Полный список карточек и строка запроса хранятся в ViewModel раздельно, а состояние экрана собирается из них функцией combine. Поэтому ввод запроса не теряет загруженные данные, а очистка поля просто возвращает весь список. Сравнение выполняется по названию плагина без учёта регистра, пробелы по краям запроса отбрасываются. Если по запросу ничего не найдено, вместо карточек выводится сообщение об этом.</w:t>
+        <w:t>Полный список карточек и строка запроса хранятся в ViewModel раздельно, а состояние экрана собирается из них функцией combine. Поэтому ввод запроса не теряет загруженные данные, а очистка поля просто возвращает весь список. Сравнение выполняется по названию плагина без учёта регистра, пробелы по краям запроса отбрасываются. Если по запросу ничего не найдено, вместо карточек выводится сообщение об этом.</w:t>
       </w:r>
     </w:p>
     <w:p>
@@ -4461,364 +4447,384 @@
         <w:rPr>
           <w:lang w:val="ru-RU"/>
         </w:rPr>
-        <w:t xml:space="preserve">-интерфейсом, а аргумент лежит полем объекта, поэтому опечатку в аргументе ловит компилятор, а не выполнение программы. В маршрут кладётся только </w:t>
-      </w:r>
-      <w:r>
-        <w:rPr>
-          <w:lang w:val="ru-RU"/>
+        <w:t>-интерфейсом, а аргумент лежит полем объекта, поэтому опечатку в аргументе ловит компилятор, а не выполнение программы. В маршрут кладётся только идентификатор, сами сведения экран получает из репозитория. Маршруты и навигатор приведены в листинге 5.</w:t>
+      </w:r>
+    </w:p>
+    <w:p>
+      <w:pPr>
+        <w:spacing w:line="240" w:lineRule="auto"/>
+        <w:rPr>
+          <w:lang w:val="ru-RU"/>
+        </w:rPr>
+      </w:pPr>
+      <w:r>
+        <w:rPr>
+          <w:rFonts w:ascii="Courier New" w:eastAsia="Courier New" w:hAnsi="Courier New" w:cs="Courier New"/>
+          <w:sz w:val="20"/>
+        </w:rPr>
+        <w:t>sealed</w:t>
+      </w:r>
+      <w:r>
+        <w:rPr>
+          <w:rFonts w:ascii="Courier New" w:eastAsia="Courier New" w:hAnsi="Courier New" w:cs="Courier New"/>
+          <w:sz w:val="20"/>
+          <w:lang w:val="ru-RU"/>
+        </w:rPr>
+        <w:t xml:space="preserve"> </w:t>
+      </w:r>
+      <w:r>
+        <w:rPr>
+          <w:rFonts w:ascii="Courier New" w:eastAsia="Courier New" w:hAnsi="Courier New" w:cs="Courier New"/>
+          <w:sz w:val="20"/>
+        </w:rPr>
+        <w:t>interface</w:t>
+      </w:r>
+      <w:r>
+        <w:rPr>
+          <w:rFonts w:ascii="Courier New" w:eastAsia="Courier New" w:hAnsi="Courier New" w:cs="Courier New"/>
+          <w:sz w:val="20"/>
+          <w:lang w:val="ru-RU"/>
+        </w:rPr>
+        <w:t xml:space="preserve"> </w:t>
+      </w:r>
+      <w:r>
+        <w:rPr>
+          <w:rFonts w:ascii="Courier New" w:eastAsia="Courier New" w:hAnsi="Courier New" w:cs="Courier New"/>
+          <w:sz w:val="20"/>
+        </w:rPr>
+        <w:t>Screen</w:t>
+      </w:r>
+      <w:r>
+        <w:rPr>
+          <w:rFonts w:ascii="Courier New" w:eastAsia="Courier New" w:hAnsi="Courier New" w:cs="Courier New"/>
+          <w:sz w:val="20"/>
+          <w:lang w:val="ru-RU"/>
+        </w:rPr>
+        <w:t xml:space="preserve"> {</w:t>
+      </w:r>
+    </w:p>
+    <w:p>
+      <w:pPr>
+        <w:spacing w:line="240" w:lineRule="auto"/>
+      </w:pPr>
+      <w:r>
+        <w:rPr>
+          <w:rFonts w:ascii="Courier New" w:eastAsia="Courier New" w:hAnsi="Courier New" w:cs="Courier New"/>
+          <w:sz w:val="20"/>
+          <w:lang w:val="ru-RU"/>
+        </w:rPr>
+        <w:t xml:space="preserve">    </w:t>
+      </w:r>
+      <w:r>
+        <w:rPr>
+          <w:rFonts w:ascii="Courier New" w:eastAsia="Courier New" w:hAnsi="Courier New" w:cs="Courier New"/>
+          <w:sz w:val="20"/>
+        </w:rPr>
+        <w:t>data</w:t>
+      </w:r>
+      <w:r>
+        <w:rPr>
+          <w:rFonts w:ascii="Courier New" w:eastAsia="Courier New" w:hAnsi="Courier New" w:cs="Courier New"/>
+          <w:sz w:val="20"/>
+        </w:rPr>
+        <w:t xml:space="preserve"> </w:t>
+      </w:r>
+      <w:r>
+        <w:rPr>
+          <w:rFonts w:ascii="Courier New" w:eastAsia="Courier New" w:hAnsi="Courier New" w:cs="Courier New"/>
+          <w:sz w:val="20"/>
+        </w:rPr>
+        <w:t>object</w:t>
+      </w:r>
+      <w:r>
+        <w:rPr>
+          <w:rFonts w:ascii="Courier New" w:eastAsia="Courier New" w:hAnsi="Courier New" w:cs="Courier New"/>
+          <w:sz w:val="20"/>
+        </w:rPr>
+        <w:t xml:space="preserve"> </w:t>
+      </w:r>
+      <w:proofErr w:type="gramStart"/>
+      <w:r>
+        <w:rPr>
+          <w:rFonts w:ascii="Courier New" w:eastAsia="Courier New" w:hAnsi="Courier New" w:cs="Courier New"/>
+          <w:sz w:val="20"/>
+        </w:rPr>
+        <w:t>Catalog</w:t>
+      </w:r>
+      <w:r>
+        <w:rPr>
+          <w:rFonts w:ascii="Courier New" w:eastAsia="Courier New" w:hAnsi="Courier New" w:cs="Courier New"/>
+          <w:sz w:val="20"/>
+        </w:rPr>
+        <w:t xml:space="preserve"> :</w:t>
+      </w:r>
+      <w:proofErr w:type="gramEnd"/>
+      <w:r>
+        <w:rPr>
+          <w:rFonts w:ascii="Courier New" w:eastAsia="Courier New" w:hAnsi="Courier New" w:cs="Courier New"/>
+          <w:sz w:val="20"/>
+        </w:rPr>
+        <w:t xml:space="preserve"> </w:t>
+      </w:r>
+      <w:r>
+        <w:rPr>
+          <w:rFonts w:ascii="Courier New" w:eastAsia="Courier New" w:hAnsi="Courier New" w:cs="Courier New"/>
+          <w:sz w:val="20"/>
+        </w:rPr>
+        <w:t>Screen</w:t>
+      </w:r>
+    </w:p>
+    <w:p>
+      <w:pPr>
+        <w:spacing w:line="240" w:lineRule="auto"/>
+      </w:pPr>
+      <w:r>
+        <w:rPr>
+          <w:rFonts w:ascii="Courier New" w:eastAsia="Courier New" w:hAnsi="Courier New" w:cs="Courier New"/>
+          <w:sz w:val="20"/>
+        </w:rPr>
+        <w:t xml:space="preserve">    </w:t>
+      </w:r>
+      <w:r>
+        <w:rPr>
+          <w:rFonts w:ascii="Courier New" w:eastAsia="Courier New" w:hAnsi="Courier New" w:cs="Courier New"/>
+          <w:sz w:val="20"/>
+        </w:rPr>
+        <w:t xml:space="preserve">data class </w:t>
+      </w:r>
+      <w:proofErr w:type="spellStart"/>
+      <w:proofErr w:type="gramStart"/>
+      <w:r>
+        <w:rPr>
+          <w:rFonts w:ascii="Courier New" w:eastAsia="Courier New" w:hAnsi="Courier New" w:cs="Courier New"/>
+          <w:sz w:val="20"/>
+        </w:rPr>
+        <w:t>PluginDetail</w:t>
+      </w:r>
+      <w:proofErr w:type="spellEnd"/>
+      <w:r>
+        <w:rPr>
+          <w:rFonts w:ascii="Courier New" w:eastAsia="Courier New" w:hAnsi="Courier New" w:cs="Courier New"/>
+          <w:sz w:val="20"/>
+        </w:rPr>
+        <w:t>(</w:t>
+      </w:r>
+      <w:proofErr w:type="spellStart"/>
+      <w:proofErr w:type="gramEnd"/>
+      <w:r>
+        <w:rPr>
+          <w:rFonts w:ascii="Courier New" w:eastAsia="Courier New" w:hAnsi="Courier New" w:cs="Courier New"/>
+          <w:sz w:val="20"/>
+        </w:rPr>
+        <w:t>val</w:t>
+      </w:r>
+      <w:proofErr w:type="spellEnd"/>
+      <w:r>
+        <w:rPr>
+          <w:rFonts w:ascii="Courier New" w:eastAsia="Courier New" w:hAnsi="Courier New" w:cs="Courier New"/>
+          <w:sz w:val="20"/>
+        </w:rPr>
+        <w:t xml:space="preserve"> </w:t>
+      </w:r>
+      <w:proofErr w:type="spellStart"/>
+      <w:r>
+        <w:rPr>
+          <w:rFonts w:ascii="Courier New" w:eastAsia="Courier New" w:hAnsi="Courier New" w:cs="Courier New"/>
+          <w:sz w:val="20"/>
+        </w:rPr>
+        <w:t>pluginId</w:t>
+      </w:r>
+      <w:proofErr w:type="spellEnd"/>
+      <w:r>
+        <w:rPr>
+          <w:rFonts w:ascii="Courier New" w:eastAsia="Courier New" w:hAnsi="Courier New" w:cs="Courier New"/>
+          <w:sz w:val="20"/>
+        </w:rPr>
+        <w:t>: Int</w:t>
+      </w:r>
+      <w:proofErr w:type="gramStart"/>
+      <w:r>
+        <w:rPr>
+          <w:rFonts w:ascii="Courier New" w:eastAsia="Courier New" w:hAnsi="Courier New" w:cs="Courier New"/>
+          <w:sz w:val="20"/>
+        </w:rPr>
+        <w:t>) :</w:t>
+      </w:r>
+      <w:proofErr w:type="gramEnd"/>
+      <w:r>
+        <w:rPr>
+          <w:rFonts w:ascii="Courier New" w:eastAsia="Courier New" w:hAnsi="Courier New" w:cs="Courier New"/>
+          <w:sz w:val="20"/>
+        </w:rPr>
+        <w:t xml:space="preserve"> Screen</w:t>
+      </w:r>
+    </w:p>
+    <w:p>
+      <w:pPr>
+        <w:spacing w:line="240" w:lineRule="auto"/>
+      </w:pPr>
+      <w:r>
+        <w:rPr>
+          <w:rFonts w:ascii="Courier New" w:eastAsia="Courier New" w:hAnsi="Courier New" w:cs="Courier New"/>
+          <w:sz w:val="20"/>
+        </w:rPr>
+        <w:t xml:space="preserve">    data class VendorPage(val vendorId: Int) : Screen</w:t>
+      </w:r>
+    </w:p>
+    <w:p>
+      <w:pPr>
+        <w:spacing w:line="240" w:lineRule="auto"/>
+      </w:pPr>
+      <w:r>
+        <w:rPr>
+          <w:rFonts w:ascii="Courier New" w:eastAsia="Courier New" w:hAnsi="Courier New" w:cs="Courier New"/>
+          <w:sz w:val="20"/>
+        </w:rPr>
+        <w:t>}</w:t>
+      </w:r>
+    </w:p>
+    <w:p>
+      <w:pPr>
+        <w:spacing w:line="240" w:lineRule="auto"/>
+      </w:pPr>
+      <w:r>
+        <w:rPr>
+          <w:rFonts w:ascii="Courier New" w:eastAsia="Courier New" w:hAnsi="Courier New" w:cs="Courier New"/>
+          <w:sz w:val="20"/>
+        </w:rPr>
+        <w:t xml:space="preserve"> </w:t>
+      </w:r>
+    </w:p>
+    <w:p>
+      <w:pPr>
+        <w:spacing w:line="240" w:lineRule="auto"/>
+      </w:pPr>
+      <w:r>
+        <w:rPr>
+          <w:rFonts w:ascii="Courier New" w:eastAsia="Courier New" w:hAnsi="Courier New" w:cs="Courier New"/>
+          <w:sz w:val="20"/>
+        </w:rPr>
+        <w:t>class Navigator {</w:t>
+      </w:r>
+    </w:p>
+    <w:p>
+      <w:pPr>
+        <w:spacing w:line="240" w:lineRule="auto"/>
+      </w:pPr>
+      <w:r>
+        <w:rPr>
+          <w:rFonts w:ascii="Courier New" w:eastAsia="Courier New" w:hAnsi="Courier New" w:cs="Courier New"/>
+          <w:sz w:val="20"/>
+        </w:rPr>
+        <w:t xml:space="preserve"> </w:t>
+      </w:r>
+    </w:p>
+    <w:p>
+      <w:pPr>
+        <w:spacing w:line="240" w:lineRule="auto"/>
+      </w:pPr>
+      <w:r>
+        <w:rPr>
+          <w:rFonts w:ascii="Courier New" w:eastAsia="Courier New" w:hAnsi="Courier New" w:cs="Courier New"/>
+          <w:sz w:val="20"/>
+        </w:rPr>
+        <w:t xml:space="preserve">    private val _backStack =</w:t>
+      </w:r>
+    </w:p>
+    <w:p>
+      <w:pPr>
+        <w:spacing w:line="240" w:lineRule="auto"/>
+      </w:pPr>
+      <w:r>
+        <w:rPr>
+          <w:rFonts w:ascii="Courier New" w:eastAsia="Courier New" w:hAnsi="Courier New" w:cs="Courier New"/>
+          <w:sz w:val="20"/>
+        </w:rPr>
+        <w:t xml:space="preserve">        MutableStateFlow&lt;List&lt;Screen&gt;&gt;(listOf(Screen.Catalog))</w:t>
+      </w:r>
+    </w:p>
+    <w:p>
+      <w:pPr>
+        <w:spacing w:line="240" w:lineRule="auto"/>
+      </w:pPr>
+      <w:r>
+        <w:rPr>
+          <w:rFonts w:ascii="Courier New" w:eastAsia="Courier New" w:hAnsi="Courier New" w:cs="Courier New"/>
+          <w:sz w:val="20"/>
+        </w:rPr>
+        <w:t xml:space="preserve">    val backStack = _backStack.asStateFlow()</w:t>
+      </w:r>
+    </w:p>
+    <w:p>
+      <w:pPr>
+        <w:spacing w:line="240" w:lineRule="auto"/>
+      </w:pPr>
+      <w:r>
+        <w:rPr>
+          <w:rFonts w:ascii="Courier New" w:eastAsia="Courier New" w:hAnsi="Courier New" w:cs="Courier New"/>
+          <w:sz w:val="20"/>
+        </w:rPr>
+        <w:t xml:space="preserve"> </w:t>
+      </w:r>
+    </w:p>
+    <w:p>
+      <w:pPr>
+        <w:spacing w:line="240" w:lineRule="auto"/>
+      </w:pPr>
+      <w:r>
+        <w:rPr>
+          <w:rFonts w:ascii="Courier New" w:eastAsia="Courier New" w:hAnsi="Courier New" w:cs="Courier New"/>
+          <w:sz w:val="20"/>
+        </w:rPr>
+        <w:t xml:space="preserve">    fun open(screen: Screen) {</w:t>
+      </w:r>
+    </w:p>
+    <w:p>
+      <w:pPr>
+        <w:spacing w:line="240" w:lineRule="auto"/>
+      </w:pPr>
+      <w:r>
+        <w:rPr>
+          <w:rFonts w:ascii="Courier New" w:eastAsia="Courier New" w:hAnsi="Courier New" w:cs="Courier New"/>
+          <w:sz w:val="20"/>
+        </w:rPr>
+        <w:t xml:space="preserve">        _backStack.update { it + screen }</w:t>
+      </w:r>
+    </w:p>
+    <w:p>
+      <w:pPr>
+        <w:spacing w:line="240" w:lineRule="auto"/>
+      </w:pPr>
+      <w:r>
+        <w:rPr>
+          <w:rFonts w:ascii="Courier New" w:eastAsia="Courier New" w:hAnsi="Courier New" w:cs="Courier New"/>
+          <w:sz w:val="20"/>
+        </w:rPr>
+        <w:t xml:space="preserve">    }</w:t>
+      </w:r>
+    </w:p>
+    <w:p>
+      <w:pPr>
+        <w:spacing w:line="240" w:lineRule="auto"/>
+      </w:pPr>
+      <w:r>
+        <w:rPr>
+          <w:rFonts w:ascii="Courier New" w:eastAsia="Courier New" w:hAnsi="Courier New" w:cs="Courier New"/>
+          <w:sz w:val="20"/>
+        </w:rPr>
+        <w:t xml:space="preserve"> </w:t>
+      </w:r>
+    </w:p>
+    <w:p>
+      <w:pPr>
+        <w:spacing w:line="240" w:lineRule="auto"/>
+      </w:pPr>
+      <w:r>
+        <w:rPr>
+          <w:rFonts w:ascii="Courier New" w:eastAsia="Courier New" w:hAnsi="Courier New" w:cs="Courier New"/>
+          <w:sz w:val="20"/>
         </w:rPr>
         <w:lastRenderedPageBreak/>
-        <w:t>идентификатор, сами сведения экран получает из репозитория. Маршруты и навигатор приведены в листинге 5.</w:t>
-      </w:r>
-    </w:p>
-    <w:p>
-      <w:pPr>
-        <w:spacing w:line="240" w:lineRule="auto"/>
-        <w:rPr>
-          <w:lang w:val="ru-RU"/>
-        </w:rPr>
-      </w:pPr>
-      <w:r>
-        <w:rPr>
-          <w:rFonts w:ascii="Courier New" w:eastAsia="Courier New" w:hAnsi="Courier New" w:cs="Courier New"/>
-          <w:sz w:val="20"/>
-        </w:rPr>
-        <w:t>sealed</w:t>
-      </w:r>
-      <w:r>
-        <w:rPr>
-          <w:rFonts w:ascii="Courier New" w:eastAsia="Courier New" w:hAnsi="Courier New" w:cs="Courier New"/>
-          <w:sz w:val="20"/>
-          <w:lang w:val="ru-RU"/>
-        </w:rPr>
-        <w:t xml:space="preserve"> </w:t>
-      </w:r>
-      <w:r>
-        <w:rPr>
-          <w:rFonts w:ascii="Courier New" w:eastAsia="Courier New" w:hAnsi="Courier New" w:cs="Courier New"/>
-          <w:sz w:val="20"/>
-        </w:rPr>
-        <w:t>interface</w:t>
-      </w:r>
-      <w:r>
-        <w:rPr>
-          <w:rFonts w:ascii="Courier New" w:eastAsia="Courier New" w:hAnsi="Courier New" w:cs="Courier New"/>
-          <w:sz w:val="20"/>
-          <w:lang w:val="ru-RU"/>
-        </w:rPr>
-        <w:t xml:space="preserve"> </w:t>
-      </w:r>
-      <w:r>
-        <w:rPr>
-          <w:rFonts w:ascii="Courier New" w:eastAsia="Courier New" w:hAnsi="Courier New" w:cs="Courier New"/>
-          <w:sz w:val="20"/>
-        </w:rPr>
-        <w:t>Screen</w:t>
-      </w:r>
-      <w:r>
-        <w:rPr>
-          <w:rFonts w:ascii="Courier New" w:eastAsia="Courier New" w:hAnsi="Courier New" w:cs="Courier New"/>
-          <w:sz w:val="20"/>
-          <w:lang w:val="ru-RU"/>
-        </w:rPr>
-        <w:t xml:space="preserve"> {</w:t>
-      </w:r>
-    </w:p>
-    <w:p>
-      <w:pPr>
-        <w:spacing w:line="240" w:lineRule="auto"/>
-        <w:rPr>
-          <w:lang w:val="ru-RU"/>
-        </w:rPr>
-      </w:pPr>
-      <w:r>
-        <w:rPr>
-          <w:rFonts w:ascii="Courier New" w:eastAsia="Courier New" w:hAnsi="Courier New" w:cs="Courier New"/>
-          <w:sz w:val="20"/>
-          <w:lang w:val="ru-RU"/>
-        </w:rPr>
-        <w:t xml:space="preserve">    </w:t>
-      </w:r>
-      <w:r>
-        <w:rPr>
-          <w:rFonts w:ascii="Courier New" w:eastAsia="Courier New" w:hAnsi="Courier New" w:cs="Courier New"/>
-          <w:sz w:val="20"/>
-        </w:rPr>
-        <w:t>data</w:t>
-      </w:r>
-      <w:r>
-        <w:rPr>
-          <w:rFonts w:ascii="Courier New" w:eastAsia="Courier New" w:hAnsi="Courier New" w:cs="Courier New"/>
-          <w:sz w:val="20"/>
-          <w:lang w:val="ru-RU"/>
-        </w:rPr>
-        <w:t xml:space="preserve"> </w:t>
-      </w:r>
-      <w:r>
-        <w:rPr>
-          <w:rFonts w:ascii="Courier New" w:eastAsia="Courier New" w:hAnsi="Courier New" w:cs="Courier New"/>
-          <w:sz w:val="20"/>
-        </w:rPr>
-        <w:t>object</w:t>
-      </w:r>
-      <w:r>
-        <w:rPr>
-          <w:rFonts w:ascii="Courier New" w:eastAsia="Courier New" w:hAnsi="Courier New" w:cs="Courier New"/>
-          <w:sz w:val="20"/>
-          <w:lang w:val="ru-RU"/>
-        </w:rPr>
-        <w:t xml:space="preserve"> </w:t>
-      </w:r>
-      <w:proofErr w:type="gramStart"/>
-      <w:r>
-        <w:rPr>
-          <w:rFonts w:ascii="Courier New" w:eastAsia="Courier New" w:hAnsi="Courier New" w:cs="Courier New"/>
-          <w:sz w:val="20"/>
-        </w:rPr>
-        <w:t>Catalog</w:t>
-      </w:r>
-      <w:r>
-        <w:rPr>
-          <w:rFonts w:ascii="Courier New" w:eastAsia="Courier New" w:hAnsi="Courier New" w:cs="Courier New"/>
-          <w:sz w:val="20"/>
-          <w:lang w:val="ru-RU"/>
-        </w:rPr>
-        <w:t xml:space="preserve"> :</w:t>
-      </w:r>
-      <w:proofErr w:type="gramEnd"/>
-      <w:r>
-        <w:rPr>
-          <w:rFonts w:ascii="Courier New" w:eastAsia="Courier New" w:hAnsi="Courier New" w:cs="Courier New"/>
-          <w:sz w:val="20"/>
-          <w:lang w:val="ru-RU"/>
-        </w:rPr>
-        <w:t xml:space="preserve"> </w:t>
-      </w:r>
-      <w:r>
-        <w:rPr>
-          <w:rFonts w:ascii="Courier New" w:eastAsia="Courier New" w:hAnsi="Courier New" w:cs="Courier New"/>
-          <w:sz w:val="20"/>
-        </w:rPr>
-        <w:t>Screen</w:t>
-      </w:r>
-    </w:p>
-    <w:p>
-      <w:pPr>
-        <w:spacing w:line="240" w:lineRule="auto"/>
-      </w:pPr>
-      <w:r>
-        <w:rPr>
-          <w:rFonts w:ascii="Courier New" w:eastAsia="Courier New" w:hAnsi="Courier New" w:cs="Courier New"/>
-          <w:sz w:val="20"/>
-          <w:lang w:val="ru-RU"/>
-        </w:rPr>
-        <w:t xml:space="preserve">    </w:t>
-      </w:r>
-      <w:r>
-        <w:rPr>
-          <w:rFonts w:ascii="Courier New" w:eastAsia="Courier New" w:hAnsi="Courier New" w:cs="Courier New"/>
-          <w:sz w:val="20"/>
-        </w:rPr>
-        <w:t xml:space="preserve">data class </w:t>
-      </w:r>
-      <w:proofErr w:type="gramStart"/>
-      <w:r>
-        <w:rPr>
-          <w:rFonts w:ascii="Courier New" w:eastAsia="Courier New" w:hAnsi="Courier New" w:cs="Courier New"/>
-          <w:sz w:val="20"/>
-        </w:rPr>
-        <w:t>PluginDetail(</w:t>
-      </w:r>
-      <w:proofErr w:type="gramEnd"/>
-      <w:r>
-        <w:rPr>
-          <w:rFonts w:ascii="Courier New" w:eastAsia="Courier New" w:hAnsi="Courier New" w:cs="Courier New"/>
-          <w:sz w:val="20"/>
-        </w:rPr>
-        <w:t>val pluginId: Int</w:t>
-      </w:r>
-      <w:proofErr w:type="gramStart"/>
-      <w:r>
-        <w:rPr>
-          <w:rFonts w:ascii="Courier New" w:eastAsia="Courier New" w:hAnsi="Courier New" w:cs="Courier New"/>
-          <w:sz w:val="20"/>
-        </w:rPr>
-        <w:t>) :</w:t>
-      </w:r>
-      <w:proofErr w:type="gramEnd"/>
-      <w:r>
-        <w:rPr>
-          <w:rFonts w:ascii="Courier New" w:eastAsia="Courier New" w:hAnsi="Courier New" w:cs="Courier New"/>
-          <w:sz w:val="20"/>
-        </w:rPr>
-        <w:t xml:space="preserve"> Screen</w:t>
-      </w:r>
-    </w:p>
-    <w:p>
-      <w:pPr>
-        <w:spacing w:line="240" w:lineRule="auto"/>
-      </w:pPr>
-      <w:r>
-        <w:rPr>
-          <w:rFonts w:ascii="Courier New" w:eastAsia="Courier New" w:hAnsi="Courier New" w:cs="Courier New"/>
-          <w:sz w:val="20"/>
-        </w:rPr>
-        <w:t xml:space="preserve">    data class VendorPage(val vendorId: Int) : Screen</w:t>
-      </w:r>
-    </w:p>
-    <w:p>
-      <w:pPr>
-        <w:spacing w:line="240" w:lineRule="auto"/>
-      </w:pPr>
-      <w:r>
-        <w:rPr>
-          <w:rFonts w:ascii="Courier New" w:eastAsia="Courier New" w:hAnsi="Courier New" w:cs="Courier New"/>
-          <w:sz w:val="20"/>
-        </w:rPr>
-        <w:t>}</w:t>
-      </w:r>
-    </w:p>
-    <w:p>
-      <w:pPr>
-        <w:spacing w:line="240" w:lineRule="auto"/>
-      </w:pPr>
-      <w:r>
-        <w:rPr>
-          <w:rFonts w:ascii="Courier New" w:eastAsia="Courier New" w:hAnsi="Courier New" w:cs="Courier New"/>
-          <w:sz w:val="20"/>
-        </w:rPr>
-        <w:t xml:space="preserve"> </w:t>
-      </w:r>
-    </w:p>
-    <w:p>
-      <w:pPr>
-        <w:spacing w:line="240" w:lineRule="auto"/>
-      </w:pPr>
-      <w:r>
-        <w:rPr>
-          <w:rFonts w:ascii="Courier New" w:eastAsia="Courier New" w:hAnsi="Courier New" w:cs="Courier New"/>
-          <w:sz w:val="20"/>
-        </w:rPr>
-        <w:t>class Navigator {</w:t>
-      </w:r>
-    </w:p>
-    <w:p>
-      <w:pPr>
-        <w:spacing w:line="240" w:lineRule="auto"/>
-      </w:pPr>
-      <w:r>
-        <w:rPr>
-          <w:rFonts w:ascii="Courier New" w:eastAsia="Courier New" w:hAnsi="Courier New" w:cs="Courier New"/>
-          <w:sz w:val="20"/>
-        </w:rPr>
-        <w:t xml:space="preserve"> </w:t>
-      </w:r>
-    </w:p>
-    <w:p>
-      <w:pPr>
-        <w:spacing w:line="240" w:lineRule="auto"/>
-      </w:pPr>
-      <w:r>
-        <w:rPr>
-          <w:rFonts w:ascii="Courier New" w:eastAsia="Courier New" w:hAnsi="Courier New" w:cs="Courier New"/>
-          <w:sz w:val="20"/>
-        </w:rPr>
-        <w:t xml:space="preserve">    private val _backStack =</w:t>
-      </w:r>
-    </w:p>
-    <w:p>
-      <w:pPr>
-        <w:spacing w:line="240" w:lineRule="auto"/>
-      </w:pPr>
-      <w:r>
-        <w:rPr>
-          <w:rFonts w:ascii="Courier New" w:eastAsia="Courier New" w:hAnsi="Courier New" w:cs="Courier New"/>
-          <w:sz w:val="20"/>
-        </w:rPr>
-        <w:t xml:space="preserve">        MutableStateFlow&lt;List&lt;Screen&gt;&gt;(listOf(Screen.Catalog))</w:t>
-      </w:r>
-    </w:p>
-    <w:p>
-      <w:pPr>
-        <w:spacing w:line="240" w:lineRule="auto"/>
-      </w:pPr>
-      <w:r>
-        <w:rPr>
-          <w:rFonts w:ascii="Courier New" w:eastAsia="Courier New" w:hAnsi="Courier New" w:cs="Courier New"/>
-          <w:sz w:val="20"/>
-        </w:rPr>
-        <w:t xml:space="preserve">    val backStack = _backStack.asStateFlow()</w:t>
-      </w:r>
-    </w:p>
-    <w:p>
-      <w:pPr>
-        <w:spacing w:line="240" w:lineRule="auto"/>
-      </w:pPr>
-      <w:r>
-        <w:rPr>
-          <w:rFonts w:ascii="Courier New" w:eastAsia="Courier New" w:hAnsi="Courier New" w:cs="Courier New"/>
-          <w:sz w:val="20"/>
-        </w:rPr>
-        <w:t xml:space="preserve"> </w:t>
-      </w:r>
-    </w:p>
-    <w:p>
-      <w:pPr>
-        <w:spacing w:line="240" w:lineRule="auto"/>
-      </w:pPr>
-      <w:r>
-        <w:rPr>
-          <w:rFonts w:ascii="Courier New" w:eastAsia="Courier New" w:hAnsi="Courier New" w:cs="Courier New"/>
-          <w:sz w:val="20"/>
-        </w:rPr>
-        <w:t xml:space="preserve">    fun open(screen: Screen) {</w:t>
-      </w:r>
-    </w:p>
-    <w:p>
-      <w:pPr>
-        <w:spacing w:line="240" w:lineRule="auto"/>
-      </w:pPr>
-      <w:r>
-        <w:rPr>
-          <w:rFonts w:ascii="Courier New" w:eastAsia="Courier New" w:hAnsi="Courier New" w:cs="Courier New"/>
-          <w:sz w:val="20"/>
-        </w:rPr>
-        <w:t xml:space="preserve">        _backStack.update { it + screen }</w:t>
-      </w:r>
-    </w:p>
-    <w:p>
-      <w:pPr>
-        <w:spacing w:line="240" w:lineRule="auto"/>
-      </w:pPr>
-      <w:r>
-        <w:rPr>
-          <w:rFonts w:ascii="Courier New" w:eastAsia="Courier New" w:hAnsi="Courier New" w:cs="Courier New"/>
-          <w:sz w:val="20"/>
-        </w:rPr>
-        <w:t xml:space="preserve">    }</w:t>
-      </w:r>
-    </w:p>
-    <w:p>
-      <w:pPr>
-        <w:spacing w:line="240" w:lineRule="auto"/>
-      </w:pPr>
-      <w:r>
-        <w:rPr>
-          <w:rFonts w:ascii="Courier New" w:eastAsia="Courier New" w:hAnsi="Courier New" w:cs="Courier New"/>
-          <w:sz w:val="20"/>
-        </w:rPr>
-        <w:t xml:space="preserve"> </w:t>
-      </w:r>
-    </w:p>
-    <w:p>
-      <w:pPr>
-        <w:spacing w:line="240" w:lineRule="auto"/>
-      </w:pPr>
-      <w:r>
-        <w:rPr>
-          <w:rFonts w:ascii="Courier New" w:eastAsia="Courier New" w:hAnsi="Courier New" w:cs="Courier New"/>
-          <w:sz w:val="20"/>
-        </w:rPr>
         <w:t xml:space="preserve">    fun back() {</w:t>
       </w:r>
     </w:p>
@@ -5021,9 +5027,6 @@
     <w:p>
       <w:pPr>
         <w:spacing w:line="240" w:lineRule="auto"/>
-        <w:rPr>
-          <w:lang w:val="ru-RU"/>
-        </w:rPr>
       </w:pPr>
       <w:r>
         <w:rPr>
@@ -5046,7 +5049,6 @@
         <w:rPr>
           <w:rFonts w:ascii="Courier New" w:eastAsia="Courier New" w:hAnsi="Courier New" w:cs="Courier New"/>
           <w:sz w:val="20"/>
-          <w:lang w:val="ru-RU"/>
         </w:rPr>
         <w:t xml:space="preserve"> = </w:t>
       </w:r>
@@ -5055,10 +5057,10 @@
         <w:rPr>
           <w:rFonts w:ascii="Courier New" w:eastAsia="Courier New" w:hAnsi="Courier New" w:cs="Courier New"/>
           <w:sz w:val="20"/>
-          <w:lang w:val="ru-RU"/>
         </w:rPr>
         <w:t xml:space="preserve">{ </w:t>
       </w:r>
+      <w:proofErr w:type="spellStart"/>
       <w:r>
         <w:rPr>
           <w:rFonts w:ascii="Courier New" w:eastAsia="Courier New" w:hAnsi="Courier New" w:cs="Courier New"/>
@@ -5071,7 +5073,6 @@
         <w:rPr>
           <w:rFonts w:ascii="Courier New" w:eastAsia="Courier New" w:hAnsi="Courier New" w:cs="Courier New"/>
           <w:sz w:val="20"/>
-          <w:lang w:val="ru-RU"/>
         </w:rPr>
         <w:t>.</w:t>
       </w:r>
@@ -5083,11 +5084,11 @@
         </w:rPr>
         <w:t>back</w:t>
       </w:r>
-      <w:r>
-        <w:rPr>
-          <w:rFonts w:ascii="Courier New" w:eastAsia="Courier New" w:hAnsi="Courier New" w:cs="Courier New"/>
-          <w:sz w:val="20"/>
-          <w:lang w:val="ru-RU"/>
+      <w:proofErr w:type="spellEnd"/>
+      <w:r>
+        <w:rPr>
+          <w:rFonts w:ascii="Courier New" w:eastAsia="Courier New" w:hAnsi="Courier New" w:cs="Courier New"/>
+          <w:sz w:val="20"/>
         </w:rPr>
         <w:t>() }</w:t>
       </w:r>
@@ -5096,7 +5097,6 @@
         <w:rPr>
           <w:rFonts w:ascii="Courier New" w:eastAsia="Courier New" w:hAnsi="Courier New" w:cs="Courier New"/>
           <w:sz w:val="20"/>
-          <w:lang w:val="ru-RU"/>
         </w:rPr>
         <w:t>,</w:t>
       </w:r>
@@ -5109,7 +5109,6 @@
         <w:rPr>
           <w:rFonts w:ascii="Courier New" w:eastAsia="Courier New" w:hAnsi="Courier New" w:cs="Courier New"/>
           <w:sz w:val="20"/>
-          <w:lang w:val="ru-RU"/>
         </w:rPr>
         <w:t xml:space="preserve">    </w:t>
       </w:r>
@@ -5389,7 +5388,6 @@
           <w:sz w:val="20"/>
           <w:lang w:val="ru-RU"/>
         </w:rPr>
-        <w:lastRenderedPageBreak/>
         <w:t xml:space="preserve">    },</w:t>
       </w:r>
     </w:p>
@@ -5489,7 +5487,14 @@
         <w:rPr>
           <w:lang w:val="ru-RU"/>
         </w:rPr>
-        <w:t>Тема представляет собой набор токенов оформления, который помещается в неявный контекст композиции. Чтение токена является чтением состояния, поэтому при смене темы перерисовываются именно те элементы, которые его прочитали. Цвет, записанный числом прямо в коде элемента, в переключении темы не участвует: мимо контекста подписка на изменение не возникает. По этой причине все цвета объявлены в одном файле.</w:t>
+        <w:t xml:space="preserve">Тема представляет собой набор токенов оформления, который помещается в неявный контекст композиции. Чтение токена является чтением состояния, поэтому при смене темы перерисовываются именно те элементы, которые его прочитали. Цвет, записанный числом прямо в коде </w:t>
+      </w:r>
+      <w:r>
+        <w:rPr>
+          <w:lang w:val="ru-RU"/>
+        </w:rPr>
+        <w:lastRenderedPageBreak/>
+        <w:t>элемента, в переключении темы не участвует: мимо контекста подписка на изменение не возникает. По этой причине все цвета объявлены в одном файле.</w:t>
       </w:r>
     </w:p>
     <w:p>
@@ -5957,7 +5962,6 @@
         <w:rPr>
           <w:lang w:val="ru-RU"/>
         </w:rPr>
-        <w:lastRenderedPageBreak/>
         <w:t>Переключатель темы размещён в заголовке приложения и хранит своё значение в памяти сеанса: сохранение настроек на диск относится к третьей вехе курса и на этой вехе не выполняется.</w:t>
       </w:r>
     </w:p>
@@ -6051,6 +6055,7 @@
           <w:rFonts w:ascii="Courier New" w:eastAsia="Courier New" w:hAnsi="Courier New" w:cs="Courier New"/>
           <w:sz w:val="20"/>
         </w:rPr>
+        <w:lastRenderedPageBreak/>
         <w:t>&lt;string name="app_title"&gt;Плагины JetBrains&lt;/string&gt;</w:t>
       </w:r>
     </w:p>
@@ -6190,7 +6195,7 @@
         <w:rPr>
           <w:lang w:val="ru-RU"/>
         </w:rPr>
-        <w:t xml:space="preserve">Паритет ключей между локалями проверяется сценарием tools/check-strings.py. Ключ, забытый в одной локали, при переключении языка оставил бы на экране текст другого языка, и глазами такая ошибка находится не всегда. Всего в ресурсах двадцать девять ключей, расхождений между локалями нет.</w:t>
+        <w:t>Паритет ключей между локалями проверяется сценарием tools/check-strings.py. Ключ, забытый в одной локали, при переключении языка оставил бы на экране текст другого языка, и глазами такая ошибка находится не всегда. Всего в ресурсах двадцать девять ключей, расхождений между локалями нет.</w:t>
       </w:r>
     </w:p>
     <w:p>
@@ -6504,7 +6509,6 @@
           <w:rFonts w:ascii="Courier New" w:eastAsia="Courier New" w:hAnsi="Courier New" w:cs="Courier New"/>
           <w:sz w:val="20"/>
         </w:rPr>
-        <w:lastRenderedPageBreak/>
         <w:t>python3 tools/check-strings.py                 # паритет ключей локалей</w:t>
       </w:r>
     </w:p>
@@ -6688,7 +6692,15 @@
                 <w:sz w:val="24"/>
                 <w:lang w:val="ru-RU"/>
               </w:rPr>
-              <w:t>Запустить приложение и прокрутить каталог</w:t>
+              <w:t xml:space="preserve">Запустить приложение и прокрутить </w:t>
+            </w:r>
+            <w:r>
+              <w:rPr>
+                <w:sz w:val="24"/>
+                <w:lang w:val="ru-RU"/>
+              </w:rPr>
+              <w:lastRenderedPageBreak/>
+              <w:t>каталог</w:t>
             </w:r>
           </w:p>
         </w:tc>
@@ -6707,7 +6719,16 @@
                 <w:sz w:val="24"/>
                 <w:lang w:val="ru-RU"/>
               </w:rPr>
-              <w:t>Двадцать восемь карточек, у каждой название, вендор, число загрузок, оценка и теги</w:t>
+              <w:lastRenderedPageBreak/>
+              <w:t xml:space="preserve">Двадцать восемь карточек, у каждой название, </w:t>
+            </w:r>
+            <w:r>
+              <w:rPr>
+                <w:sz w:val="24"/>
+                <w:lang w:val="ru-RU"/>
+              </w:rPr>
+              <w:lastRenderedPageBreak/>
+              <w:t>вендор, число загрузок, оценка и теги</w:t>
             </w:r>
           </w:p>
         </w:tc>
@@ -6728,7 +6749,8 @@
                 <w:sz w:val="24"/>
                 <w:lang w:val="ru-RU"/>
               </w:rPr>
-              <w:t xml:space="preserve">Ввести в поле поиска «kot», затем нажать крестик в поле</w:t>
+              <w:lastRenderedPageBreak/>
+              <w:t>Ввести в поле поиска «kot», затем нажать крестик в поле</w:t>
             </w:r>
           </w:p>
         </w:tc>
@@ -6747,7 +6769,7 @@
                 <w:sz w:val="24"/>
                 <w:lang w:val="ru-RU"/>
               </w:rPr>
-              <w:t xml:space="preserve">Остаются четыре плагина с «kot» в названии, регистр букв не учитывается; после очистки возвращаются все двадцать восемь карточек</w:t>
+              <w:t>Остаются четыре плагина с «kot» в названии, регистр букв не учитывается; после очистки возвращаются все двадцать восемь карточек</w:t>
             </w:r>
           </w:p>
         </w:tc>
@@ -7103,9 +7125,6 @@
     <w:p>
       <w:pPr>
         <w:spacing w:line="240" w:lineRule="auto"/>
-        <w:rPr>
-          <w:lang w:val="ru-RU"/>
-        </w:rPr>
       </w:pPr>
       <w:proofErr w:type="spellStart"/>
       <w:r>
@@ -7120,7 +7139,6 @@
         <w:rPr>
           <w:rFonts w:ascii="Courier New" w:eastAsia="Courier New" w:hAnsi="Courier New" w:cs="Courier New"/>
           <w:sz w:val="20"/>
-          <w:lang w:val="ru-RU"/>
         </w:rPr>
         <w:t xml:space="preserve"> </w:t>
       </w:r>
@@ -7135,7 +7153,6 @@
         <w:rPr>
           <w:rFonts w:ascii="Courier New" w:eastAsia="Courier New" w:hAnsi="Courier New" w:cs="Courier New"/>
           <w:sz w:val="20"/>
-          <w:lang w:val="ru-RU"/>
         </w:rPr>
         <w:t xml:space="preserve"> </w:t>
       </w:r>
@@ -7150,7 +7167,6 @@
         <w:rPr>
           <w:rFonts w:ascii="Courier New" w:eastAsia="Courier New" w:hAnsi="Courier New" w:cs="Courier New"/>
           <w:sz w:val="20"/>
-          <w:lang w:val="ru-RU"/>
         </w:rPr>
         <w:t xml:space="preserve"> </w:t>
       </w:r>
@@ -7159,7 +7175,6 @@
         <w:rPr>
           <w:rFonts w:ascii="Courier New" w:eastAsia="Courier New" w:hAnsi="Courier New" w:cs="Courier New"/>
           <w:sz w:val="20"/>
-          <w:lang w:val="ru-RU"/>
         </w:rPr>
         <w:t>....</w:t>
       </w:r>
@@ -7175,7 +7190,6 @@
         <w:rPr>
           <w:rFonts w:ascii="Courier New" w:eastAsia="Courier New" w:hAnsi="Courier New" w:cs="Courier New"/>
           <w:sz w:val="20"/>
-          <w:lang w:val="ru-RU"/>
         </w:rPr>
         <w:t>()</w:t>
       </w:r>
@@ -7184,13 +7198,23 @@
       <w:pPr>
         <w:spacing w:line="240" w:lineRule="auto"/>
       </w:pPr>
-      <w:r>
-        <w:rPr>
-          <w:rFonts w:ascii="Courier New" w:eastAsia="Courier New" w:hAnsi="Courier New" w:cs="Courier New"/>
-          <w:sz w:val="20"/>
-        </w:rPr>
-        <w:t>restartable skippable fun ....</w:t>
-      </w:r>
+      <w:proofErr w:type="spellStart"/>
+      <w:r>
+        <w:rPr>
+          <w:rFonts w:ascii="Courier New" w:eastAsia="Courier New" w:hAnsi="Courier New" w:cs="Courier New"/>
+          <w:sz w:val="20"/>
+        </w:rPr>
+        <w:t>restartable</w:t>
+      </w:r>
+      <w:proofErr w:type="spellEnd"/>
+      <w:r>
+        <w:rPr>
+          <w:rFonts w:ascii="Courier New" w:eastAsia="Courier New" w:hAnsi="Courier New" w:cs="Courier New"/>
+          <w:sz w:val="20"/>
+        </w:rPr>
+        <w:t xml:space="preserve"> skippable fun ....</w:t>
+      </w:r>
+      <w:proofErr w:type="spellStart"/>
       <w:proofErr w:type="gramStart"/>
       <w:r>
         <w:rPr>
@@ -7213,7 +7237,15 @@
           <w:rFonts w:ascii="Courier New" w:eastAsia="Courier New" w:hAnsi="Courier New" w:cs="Courier New"/>
           <w:sz w:val="20"/>
         </w:rPr>
-        <w:t>AppScaffold(</w:t>
+        <w:t>AppScaffold</w:t>
+      </w:r>
+      <w:proofErr w:type="spellEnd"/>
+      <w:r>
+        <w:rPr>
+          <w:rFonts w:ascii="Courier New" w:eastAsia="Courier New" w:hAnsi="Courier New" w:cs="Courier New"/>
+          <w:sz w:val="20"/>
+        </w:rPr>
+        <w:t>(</w:t>
       </w:r>
       <w:proofErr w:type="gramEnd"/>
     </w:p>
@@ -7299,7 +7331,7 @@
         <w:rPr>
           <w:lang w:val="ru-RU"/>
         </w:rPr>
-        <w:t xml:space="preserve">Пометка перезапускаемой и пропускаемой функции означает, что среда исполнения умеет вызвать экран заново отдельно от родителя и может не заходить в его тело, если параметры не изменились. Все восемнадцать композиций проекта помечены таким образом. Класс состояния каталога при этом отнесён к типам неопределённой стабильности, поскольку содержит список, реализация которого выясняется во время выполнения; пропуск перерисовки это не нарушает, так как состояние приходит в экран извне и в его теле не создаётся.</w:t>
+        <w:t>Пометка перезапускаемой и пропускаемой функции означает, что среда исполнения умеет вызвать экран заново отдельно от родителя и может не заходить в его тело, если параметры не изменились. Все восемнадцать композиций проекта помечены таким образом. Класс состояния каталога при этом отнесён к типам неопределённой стабильности, поскольку содержит список, реализация которого выясняется во время выполнения; пропуск перерисовки это не нарушает, так как состояние приходит в экран извне и в его теле не создаётся.</w:t>
       </w:r>
     </w:p>
     <w:p>
@@ -7314,7 +7346,7 @@
         <w:rPr>
           <w:lang w:val="ru-RU"/>
         </w:rPr>
-        <w:t xml:space="preserve">Внешний вид приложения приведён на рисунках 1–5.</w:t>
+        <w:t>Внешний вид приложения приведён на рисунках 1–5.</w:t>
       </w:r>
     </w:p>
     <w:p>
@@ -7326,6 +7358,7 @@
         <w:rPr>
           <w:noProof/>
         </w:rPr>
+        <w:lastRenderedPageBreak/>
         <w:drawing>
           <wp:inline distT="0" distB="0" distL="0" distR="0" wp14:anchorId="5C1776EC" wp14:editId="0B3A29F5">
             <wp:extent cx="2232000" cy="5009600"/>
@@ -7384,8 +7417,9 @@
         <w:rPr>
           <w:noProof/>
         </w:rPr>
+        <w:lastRenderedPageBreak/>
         <w:drawing>
-          <wp:inline distT="0" distB="0" distL="0" distR="0">
+          <wp:inline distT="0" distB="0" distL="0" distR="0" wp14:anchorId="35B34220" wp14:editId="38FC98CC">
             <wp:extent cx="2232000" cy="5009600"/>
             <wp:effectExtent l="0" t="0" r="0" b="0"/>
             <wp:docPr id="5" name="Picture 5"/>
@@ -7397,65 +7431,6 @@
                 <pic:pic xmlns:pic="http://schemas.openxmlformats.org/drawingml/2006/picture">
                   <pic:nvPicPr>
                     <pic:cNvPr id="0" name="fig_search.png"/>
-                    <pic:cNvPicPr/>
-                  </pic:nvPicPr>
-                  <pic:blipFill>
-                    <a:blip r:embed="rId16"/>
-                    <a:stretch>
-                      <a:fillRect/>
-                    </a:stretch>
-                  </pic:blipFill>
-                  <pic:spPr>
-                    <a:xfrm>
-                      <a:off x="0" y="0"/>
-                      <a:ext cx="2232000" cy="5009600"/>
-                    </a:xfrm>
-                    <a:prstGeom prst="rect">
-                      <a:avLst/>
-                    </a:prstGeom>
-                  </pic:spPr>
-                </pic:pic>
-              </a:graphicData>
-            </a:graphic>
-          </wp:inline>
-        </w:drawing>
-      </w:r>
-    </w:p>
-    <w:p>
-      <w:pPr>
-        <w:spacing w:before="120" w:after="240"/>
-        <w:jc w:val="center"/>
-      </w:pPr>
-      <w:r>
-        <w:rPr>
-          <w:sz w:val="24"/>
-        </w:rPr>
-        <w:t>Рисунок 2 – Поиск по названию в каталоге</w:t>
-      </w:r>
-    </w:p>
-    <w:p>
-      <w:pPr>
-        <w:spacing w:before="240"/>
-        <w:jc w:val="center"/>
-      </w:pPr>
-      <w:r>
-        <w:rPr>
-          <w:noProof/>
-        </w:rPr>
-        <w:lastRenderedPageBreak/>
-        <w:drawing>
-          <wp:inline distT="0" distB="0" distL="0" distR="0" wp14:anchorId="516856E6" wp14:editId="2ADA868E">
-            <wp:extent cx="2232000" cy="5009600"/>
-            <wp:effectExtent l="0" t="0" r="0" b="0"/>
-            <wp:docPr id="2" name="Picture 2"/>
-            <wp:cNvGraphicFramePr>
-              <a:graphicFrameLocks xmlns:a="http://schemas.openxmlformats.org/drawingml/2006/main" noChangeAspect="1"/>
-            </wp:cNvGraphicFramePr>
-            <a:graphic xmlns:a="http://schemas.openxmlformats.org/drawingml/2006/main">
-              <a:graphicData uri="http://schemas.openxmlformats.org/drawingml/2006/picture">
-                <pic:pic xmlns:pic="http://schemas.openxmlformats.org/drawingml/2006/picture">
-                  <pic:nvPicPr>
-                    <pic:cNvPr id="0" name="fig2_detail.png"/>
                     <pic:cNvPicPr/>
                   </pic:nvPicPr>
                   <pic:blipFill>
@@ -7484,12 +7459,16 @@
       <w:pPr>
         <w:spacing w:before="120" w:after="240"/>
         <w:jc w:val="center"/>
+        <w:rPr>
+          <w:lang w:val="ru-RU"/>
+        </w:rPr>
       </w:pPr>
       <w:r>
         <w:rPr>
           <w:sz w:val="24"/>
-        </w:rPr>
-        <w:t>Рисунок 3 – Экран детали плагина</w:t>
+          <w:lang w:val="ru-RU"/>
+        </w:rPr>
+        <w:t>Рисунок 2 – Поиск по названию в каталоге</w:t>
       </w:r>
     </w:p>
     <w:p>
@@ -7503,10 +7482,10 @@
         </w:rPr>
         <w:lastRenderedPageBreak/>
         <w:drawing>
-          <wp:inline distT="0" distB="0" distL="0" distR="0" wp14:anchorId="1C68B6A0" wp14:editId="7832E513">
+          <wp:inline distT="0" distB="0" distL="0" distR="0" wp14:anchorId="516856E6" wp14:editId="2ADA868E">
             <wp:extent cx="2232000" cy="5009600"/>
             <wp:effectExtent l="0" t="0" r="0" b="0"/>
-            <wp:docPr id="3" name="Picture 3"/>
+            <wp:docPr id="2" name="Picture 2"/>
             <wp:cNvGraphicFramePr>
               <a:graphicFrameLocks xmlns:a="http://schemas.openxmlformats.org/drawingml/2006/main" noChangeAspect="1"/>
             </wp:cNvGraphicFramePr>
@@ -7514,7 +7493,7 @@
               <a:graphicData uri="http://schemas.openxmlformats.org/drawingml/2006/picture">
                 <pic:pic xmlns:pic="http://schemas.openxmlformats.org/drawingml/2006/picture">
                   <pic:nvPicPr>
-                    <pic:cNvPr id="0" name="fig3_vendor_dark.png"/>
+                    <pic:cNvPr id="0" name="fig2_detail.png"/>
                     <pic:cNvPicPr/>
                   </pic:nvPicPr>
                   <pic:blipFill>
@@ -7543,16 +7522,12 @@
       <w:pPr>
         <w:spacing w:before="120" w:after="240"/>
         <w:jc w:val="center"/>
-        <w:rPr>
-          <w:lang w:val="ru-RU"/>
-        </w:rPr>
       </w:pPr>
       <w:r>
         <w:rPr>
           <w:sz w:val="24"/>
-          <w:lang w:val="ru-RU"/>
-        </w:rPr>
-        <w:t>Рисунок 4 – Страница вендора в тёмной теме</w:t>
+        </w:rPr>
+        <w:t>Рисунок 3 – Экран детали плагина</w:t>
       </w:r>
     </w:p>
     <w:p>
@@ -7566,10 +7541,10 @@
         </w:rPr>
         <w:lastRenderedPageBreak/>
         <w:drawing>
-          <wp:inline distT="0" distB="0" distL="0" distR="0" wp14:anchorId="538AF8A5" wp14:editId="1571BD9E">
+          <wp:inline distT="0" distB="0" distL="0" distR="0" wp14:anchorId="1C68B6A0" wp14:editId="7832E513">
             <wp:extent cx="2232000" cy="5009600"/>
             <wp:effectExtent l="0" t="0" r="0" b="0"/>
-            <wp:docPr id="4" name="Picture 4"/>
+            <wp:docPr id="3" name="Picture 3"/>
             <wp:cNvGraphicFramePr>
               <a:graphicFrameLocks xmlns:a="http://schemas.openxmlformats.org/drawingml/2006/main" noChangeAspect="1"/>
             </wp:cNvGraphicFramePr>
@@ -7577,7 +7552,7 @@
               <a:graphicData uri="http://schemas.openxmlformats.org/drawingml/2006/picture">
                 <pic:pic xmlns:pic="http://schemas.openxmlformats.org/drawingml/2006/picture">
                   <pic:nvPicPr>
-                    <pic:cNvPr id="0" name="fig4_en.png"/>
+                    <pic:cNvPr id="0" name="fig3_vendor_dark.png"/>
                     <pic:cNvPicPr/>
                   </pic:nvPicPr>
                   <pic:blipFill>
@@ -7615,6 +7590,69 @@
           <w:sz w:val="24"/>
           <w:lang w:val="ru-RU"/>
         </w:rPr>
+        <w:t>Рисунок 4 – Страница вендора в тёмной теме</w:t>
+      </w:r>
+    </w:p>
+    <w:p>
+      <w:pPr>
+        <w:spacing w:before="240"/>
+        <w:jc w:val="center"/>
+      </w:pPr>
+      <w:r>
+        <w:rPr>
+          <w:noProof/>
+        </w:rPr>
+        <w:lastRenderedPageBreak/>
+        <w:drawing>
+          <wp:inline distT="0" distB="0" distL="0" distR="0" wp14:anchorId="538AF8A5" wp14:editId="1571BD9E">
+            <wp:extent cx="2232000" cy="5009600"/>
+            <wp:effectExtent l="0" t="0" r="0" b="0"/>
+            <wp:docPr id="4" name="Picture 4"/>
+            <wp:cNvGraphicFramePr>
+              <a:graphicFrameLocks xmlns:a="http://schemas.openxmlformats.org/drawingml/2006/main" noChangeAspect="1"/>
+            </wp:cNvGraphicFramePr>
+            <a:graphic xmlns:a="http://schemas.openxmlformats.org/drawingml/2006/main">
+              <a:graphicData uri="http://schemas.openxmlformats.org/drawingml/2006/picture">
+                <pic:pic xmlns:pic="http://schemas.openxmlformats.org/drawingml/2006/picture">
+                  <pic:nvPicPr>
+                    <pic:cNvPr id="0" name="fig4_en.png"/>
+                    <pic:cNvPicPr/>
+                  </pic:nvPicPr>
+                  <pic:blipFill>
+                    <a:blip r:embed="rId12"/>
+                    <a:stretch>
+                      <a:fillRect/>
+                    </a:stretch>
+                  </pic:blipFill>
+                  <pic:spPr>
+                    <a:xfrm>
+                      <a:off x="0" y="0"/>
+                      <a:ext cx="2232000" cy="5009600"/>
+                    </a:xfrm>
+                    <a:prstGeom prst="rect">
+                      <a:avLst/>
+                    </a:prstGeom>
+                  </pic:spPr>
+                </pic:pic>
+              </a:graphicData>
+            </a:graphic>
+          </wp:inline>
+        </w:drawing>
+      </w:r>
+    </w:p>
+    <w:p>
+      <w:pPr>
+        <w:spacing w:before="120" w:after="240"/>
+        <w:jc w:val="center"/>
+        <w:rPr>
+          <w:lang w:val="ru-RU"/>
+        </w:rPr>
+      </w:pPr>
+      <w:r>
+        <w:rPr>
+          <w:sz w:val="24"/>
+          <w:lang w:val="ru-RU"/>
+        </w:rPr>
         <w:t>Рисунок 5 – Интерфейс на второй локали</w:t>
       </w:r>
     </w:p>
@@ -7786,7 +7824,14 @@
         <w:rPr>
           <w:lang w:val="ru-RU"/>
         </w:rPr>
-        <w:t xml:space="preserve">Реализованы три экрана и навигация между ними библиотекой Navigation 3, где маршрут является объектом, а стек маршрутов – обычным списком. В каталоге работает поиск по названию плагина. Экраны получают состояние и обработчик намерений, а не класс ViewModel целиком, поэтому все композиции остаются перезапускаемыми и пропускаемыми по отчёту компилятора. Цвета вынесены в тему, переключение светлого и тёмного оформления работает, подписи интерфейса вынесены в строковые ресурсы и переведены на второй язык, а паритет ключей локалей проверяется отдельным сценарием.</w:t>
+        <w:t xml:space="preserve">Реализованы три экрана и навигация между ними библиотекой Navigation 3, где маршрут является объектом, а стек маршрутов – обычным списком. В каталоге работает поиск по названию плагина. Экраны получают состояние и обработчик намерений, а не класс ViewModel целиком, поэтому все композиции остаются перезапускаемыми и пропускаемыми по отчёту </w:t>
+      </w:r>
+      <w:r>
+        <w:rPr>
+          <w:lang w:val="ru-RU"/>
+        </w:rPr>
+        <w:lastRenderedPageBreak/>
+        <w:t>компилятора. Цвета вынесены в тему, переключение светлого и тёмного оформления работает, подписи интерфейса вынесены в строковые ресурсы и переведены на второй язык, а паритет ключей локалей проверяется отдельным сценарием.</w:t>
       </w:r>
     </w:p>
     <w:p>
@@ -8172,8 +8217,8 @@
       </w:r>
     </w:p>
     <w:sectPr>
-      <w:footerReference w:type="even" r:id="rId12"/>
-      <w:footerReference w:type="default" r:id="rId13"/>
+      <w:footerReference w:type="even" r:id="rId13"/>
+      <w:footerReference w:type="default" r:id="rId14"/>
       <w:pgSz w:w="11906" w:h="16838"/>
       <w:pgMar w:top="1134" w:right="850" w:bottom="1134" w:left="1701" w:header="708" w:footer="708" w:gutter="0"/>
       <w:cols w:space="720"/>

</xml_diff>